<commit_message>
docs(#1008): regenerate TOOLCHAIN.docx from markdown (office-drift)
</commit_message>
<xml_diff>
--- a/docs/office/TOOLCHAIN.docx
+++ b/docs/office/TOOLCHAIN.docx
@@ -2,7 +2,7 @@
 <file path=word/document.xml><?xml version="1.0" encoding="utf-8"?>
 <w:document xmlns:w="http://schemas.openxmlformats.org/wordprocessingml/2006/main" xmlns:m="http://schemas.openxmlformats.org/officeDocument/2006/math" xmlns:r="http://schemas.openxmlformats.org/officeDocument/2006/relationships" xmlns:o="urn:schemas-microsoft-com:office:office" xmlns:v="urn:schemas-microsoft-com:vml" xmlns:w10="urn:schemas-microsoft-com:office:word" xmlns:a="http://schemas.openxmlformats.org/drawingml/2006/main" xmlns:pic="http://schemas.openxmlformats.org/drawingml/2006/picture" xmlns:wp="http://schemas.openxmlformats.org/drawingml/2006/wordprocessingDrawing">
   <w:body>
-    <w:bookmarkStart w:id="27" w:name="noorina-labs--contributor-toolchain"/>
+    <w:bookmarkStart w:id="29" w:name="noorina-labs--contributor-toolchain"/>
     <w:p>
       <w:pPr>
         <w:pStyle w:val="Heading1"/>
@@ -931,6 +931,374 @@
                 <w:rStyle w:val="VerbatimChar"/>
               </w:rPr>
               <w:t xml:space="preserve">apt install gh</w:t>
+            </w:r>
+          </w:p>
+        </w:tc>
+      </w:tr>
+      <w:tr>
+        <w:tc>
+          <w:tcPr/>
+          <w:p>
+            <w:pPr>
+              <w:pStyle w:val="Compact"/>
+            </w:pPr>
+            <w:r>
+              <w:rPr>
+                <w:rStyle w:val="VerbatimChar"/>
+              </w:rPr>
+              <w:t xml:space="preserve">rg</w:t>
+            </w:r>
+            <w:r>
+              <w:t xml:space="preserve"> </w:t>
+            </w:r>
+            <w:r>
+              <w:t xml:space="preserve">(ripgrep)</w:t>
+            </w:r>
+          </w:p>
+        </w:tc>
+        <w:tc>
+          <w:tcPr/>
+          <w:p>
+            <w:pPr>
+              <w:pStyle w:val="Compact"/>
+            </w:pPr>
+            <w:r>
+              <w:rPr>
+                <w:b/>
+                <w:bCs/>
+              </w:rPr>
+              <w:t xml:space="preserve">mandated</w:t>
+            </w:r>
+            <w:r>
+              <w:t xml:space="preserve"> </w:t>
+            </w:r>
+            <w:r>
+              <w:t xml:space="preserve">literal/line text search — used by</w:t>
+            </w:r>
+            <w:r>
+              <w:t xml:space="preserve"> </w:t>
+            </w:r>
+            <w:r>
+              <w:rPr>
+                <w:rStyle w:val="VerbatimChar"/>
+              </w:rPr>
+              <w:t xml:space="preserve">.claude/</w:t>
+            </w:r>
+            <w:r>
+              <w:t xml:space="preserve"> </w:t>
+            </w:r>
+            <w:r>
+              <w:t xml:space="preserve">scripts + the agent;</w:t>
+            </w:r>
+            <w:r>
+              <w:t xml:space="preserve"> </w:t>
+            </w:r>
+            <w:r>
+              <w:rPr>
+                <w:b/>
+                <w:bCs/>
+              </w:rPr>
+              <w:t xml:space="preserve">never plain</w:t>
+            </w:r>
+            <w:r>
+              <w:rPr>
+                <w:b/>
+                <w:bCs/>
+              </w:rPr>
+              <w:t xml:space="preserve"> </w:t>
+            </w:r>
+            <w:r>
+              <w:rPr>
+                <w:rStyle w:val="VerbatimChar"/>
+                <w:b/>
+                <w:bCs/>
+              </w:rPr>
+              <w:t xml:space="preserve">grep</w:t>
+            </w:r>
+            <w:r>
+              <w:t xml:space="preserve"> </w:t>
+            </w:r>
+            <w:r>
+              <w:t xml:space="preserve">(§ Text search:</w:t>
+            </w:r>
+            <w:r>
+              <w:t xml:space="preserve"> </w:t>
+            </w:r>
+            <w:r>
+              <w:rPr>
+                <w:rStyle w:val="VerbatimChar"/>
+              </w:rPr>
+              <w:t xml:space="preserve">rg</w:t>
+            </w:r>
+            <w:r>
+              <w:t xml:space="preserve">, not</w:t>
+            </w:r>
+            <w:r>
+              <w:t xml:space="preserve"> </w:t>
+            </w:r>
+            <w:r>
+              <w:rPr>
+                <w:rStyle w:val="VerbatimChar"/>
+              </w:rPr>
+              <w:t xml:space="preserve">grep</w:t>
+            </w:r>
+            <w:r>
+              <w:t xml:space="preserve">)</w:t>
+            </w:r>
+          </w:p>
+        </w:tc>
+        <w:tc>
+          <w:tcPr/>
+          <w:p>
+            <w:pPr>
+              <w:pStyle w:val="Compact"/>
+            </w:pPr>
+            <w:r>
+              <w:rPr>
+                <w:rStyle w:val="VerbatimChar"/>
+              </w:rPr>
+              <w:t xml:space="preserve">brew install ripgrep</w:t>
+            </w:r>
+            <w:r>
+              <w:t xml:space="preserve"> </w:t>
+            </w:r>
+            <w:r>
+              <w:t xml:space="preserve">·</w:t>
+            </w:r>
+            <w:r>
+              <w:t xml:space="preserve"> </w:t>
+            </w:r>
+            <w:r>
+              <w:rPr>
+                <w:rStyle w:val="VerbatimChar"/>
+              </w:rPr>
+              <w:t xml:space="preserve">apt install ripgrep</w:t>
+            </w:r>
+          </w:p>
+        </w:tc>
+      </w:tr>
+      <w:tr>
+        <w:tc>
+          <w:tcPr/>
+          <w:p>
+            <w:pPr>
+              <w:pStyle w:val="Compact"/>
+            </w:pPr>
+            <w:r>
+              <w:rPr>
+                <w:rStyle w:val="VerbatimChar"/>
+              </w:rPr>
+              <w:t xml:space="preserve">jq</w:t>
+            </w:r>
+          </w:p>
+        </w:tc>
+        <w:tc>
+          <w:tcPr/>
+          <w:p>
+            <w:pPr>
+              <w:pStyle w:val="Compact"/>
+            </w:pPr>
+            <w:r>
+              <w:t xml:space="preserve">JSON query in hooks/skills/CI (</w:t>
+            </w:r>
+            <w:r>
+              <w:rPr>
+                <w:rStyle w:val="VerbatimChar"/>
+              </w:rPr>
+              <w:t xml:space="preserve">gh … --json … | jq</w:t>
+            </w:r>
+            <w:r>
+              <w:t xml:space="preserve">)</w:t>
+            </w:r>
+          </w:p>
+        </w:tc>
+        <w:tc>
+          <w:tcPr/>
+          <w:p>
+            <w:pPr>
+              <w:pStyle w:val="Compact"/>
+            </w:pPr>
+            <w:r>
+              <w:rPr>
+                <w:rStyle w:val="VerbatimChar"/>
+              </w:rPr>
+              <w:t xml:space="preserve">brew install jq</w:t>
+            </w:r>
+            <w:r>
+              <w:t xml:space="preserve"> </w:t>
+            </w:r>
+            <w:r>
+              <w:t xml:space="preserve">·</w:t>
+            </w:r>
+            <w:r>
+              <w:t xml:space="preserve"> </w:t>
+            </w:r>
+            <w:r>
+              <w:rPr>
+                <w:rStyle w:val="VerbatimChar"/>
+              </w:rPr>
+              <w:t xml:space="preserve">apt install jq</w:t>
+            </w:r>
+          </w:p>
+        </w:tc>
+      </w:tr>
+      <w:tr>
+        <w:tc>
+          <w:tcPr/>
+          <w:p>
+            <w:pPr>
+              <w:pStyle w:val="Compact"/>
+            </w:pPr>
+            <w:r>
+              <w:rPr>
+                <w:rStyle w:val="VerbatimChar"/>
+              </w:rPr>
+              <w:t xml:space="preserve">fd</w:t>
+            </w:r>
+            <w:r>
+              <w:t xml:space="preserve"> </w:t>
+            </w:r>
+            <w:r>
+              <w:t xml:space="preserve">(</w:t>
+            </w:r>
+            <w:r>
+              <w:rPr>
+                <w:rStyle w:val="VerbatimChar"/>
+              </w:rPr>
+              <w:t xml:space="preserve">fdfind</w:t>
+            </w:r>
+            <w:r>
+              <w:t xml:space="preserve">)</w:t>
+            </w:r>
+          </w:p>
+        </w:tc>
+        <w:tc>
+          <w:tcPr/>
+          <w:p>
+            <w:pPr>
+              <w:pStyle w:val="Compact"/>
+            </w:pPr>
+            <w:r>
+              <w:t xml:space="preserve">fast file find (companion to</w:t>
+            </w:r>
+            <w:r>
+              <w:t xml:space="preserve"> </w:t>
+            </w:r>
+            <w:r>
+              <w:rPr>
+                <w:rStyle w:val="VerbatimChar"/>
+              </w:rPr>
+              <w:t xml:space="preserve">rg</w:t>
+            </w:r>
+            <w:r>
+              <w:t xml:space="preserve">); Debian/Ubuntu ships it as</w:t>
+            </w:r>
+            <w:r>
+              <w:t xml:space="preserve"> </w:t>
+            </w:r>
+            <w:r>
+              <w:rPr>
+                <w:rStyle w:val="VerbatimChar"/>
+              </w:rPr>
+              <w:t xml:space="preserve">fdfind</w:t>
+            </w:r>
+          </w:p>
+        </w:tc>
+        <w:tc>
+          <w:tcPr/>
+          <w:p>
+            <w:pPr>
+              <w:pStyle w:val="Compact"/>
+            </w:pPr>
+            <w:r>
+              <w:rPr>
+                <w:rStyle w:val="VerbatimChar"/>
+              </w:rPr>
+              <w:t xml:space="preserve">brew install fd</w:t>
+            </w:r>
+            <w:r>
+              <w:t xml:space="preserve"> </w:t>
+            </w:r>
+            <w:r>
+              <w:t xml:space="preserve">·</w:t>
+            </w:r>
+            <w:r>
+              <w:t xml:space="preserve"> </w:t>
+            </w:r>
+            <w:r>
+              <w:rPr>
+                <w:rStyle w:val="VerbatimChar"/>
+              </w:rPr>
+              <w:t xml:space="preserve">apt install fd-find</w:t>
+            </w:r>
+          </w:p>
+        </w:tc>
+      </w:tr>
+      <w:tr>
+        <w:tc>
+          <w:tcPr/>
+          <w:p>
+            <w:pPr>
+              <w:pStyle w:val="Compact"/>
+            </w:pPr>
+            <w:r>
+              <w:rPr>
+                <w:rStyle w:val="VerbatimChar"/>
+              </w:rPr>
+              <w:t xml:space="preserve">ast-grep</w:t>
+            </w:r>
+          </w:p>
+        </w:tc>
+        <w:tc>
+          <w:tcPr/>
+          <w:p>
+            <w:pPr>
+              <w:pStyle w:val="Compact"/>
+            </w:pPr>
+            <w:r>
+              <w:t xml:space="preserve">structural (AST) search/replace — preferred over regex for code (§ Structural &amp; AST tooling). ⚠</w:t>
+            </w:r>
+            <w:r>
+              <w:t xml:space="preserve"> </w:t>
+            </w:r>
+            <w:r>
+              <w:rPr>
+                <w:b/>
+                <w:bCs/>
+              </w:rPr>
+              <w:t xml:space="preserve">not installed by default on the dev box</w:t>
+            </w:r>
+            <w:r>
+              <w:t xml:space="preserve">; install before relying on it</w:t>
+            </w:r>
+          </w:p>
+        </w:tc>
+        <w:tc>
+          <w:tcPr/>
+          <w:p>
+            <w:pPr>
+              <w:pStyle w:val="Compact"/>
+            </w:pPr>
+            <w:r>
+              <w:rPr>
+                <w:rStyle w:val="VerbatimChar"/>
+              </w:rPr>
+              <w:t xml:space="preserve">brew install ast-grep</w:t>
+            </w:r>
+            <w:r>
+              <w:t xml:space="preserve"> </w:t>
+            </w:r>
+            <w:r>
+              <w:t xml:space="preserve">·</w:t>
+            </w:r>
+            <w:r>
+              <w:t xml:space="preserve"> </w:t>
+            </w:r>
+            <w:r>
+              <w:rPr>
+                <w:rStyle w:val="VerbatimChar"/>
+              </w:rPr>
+              <w:t xml:space="preserve">cargo install ast-grep</w:t>
             </w:r>
           </w:p>
         </w:tc>
@@ -3096,13 +3464,34 @@
     </w:p>
     <w:bookmarkEnd w:id="15"/>
     <w:bookmarkEnd w:id="16"/>
-    <w:bookmarkStart w:id="20" w:name="structural--ast-tooling"/>
+    <w:bookmarkStart w:id="18" w:name="text-search-rg-not-grep"/>
     <w:p>
       <w:pPr>
         <w:pStyle w:val="Heading2"/>
       </w:pPr>
       <w:r>
-        <w:t xml:space="preserve">Structural &amp; AST tooling</w:t>
+        <w:t xml:space="preserve">Text search:</w:t>
+      </w:r>
+      <w:r>
+        <w:t xml:space="preserve"> </w:t>
+      </w:r>
+      <w:r>
+        <w:rPr>
+          <w:rStyle w:val="VerbatimChar"/>
+        </w:rPr>
+        <w:t xml:space="preserve">rg</w:t>
+      </w:r>
+      <w:r>
+        <w:t xml:space="preserve">, not</w:t>
+      </w:r>
+      <w:r>
+        <w:t xml:space="preserve"> </w:t>
+      </w:r>
+      <w:r>
+        <w:rPr>
+          <w:rStyle w:val="VerbatimChar"/>
+        </w:rPr>
+        <w:t xml:space="preserve">grep</w:t>
       </w:r>
     </w:p>
     <w:p>
@@ -3110,59 +3499,18 @@
         <w:pStyle w:val="FirstParagraph"/>
       </w:pPr>
       <w:r>
-        <w:t xml:space="preserve">Every code/YAML/shell-scanning gate we run today is Python regex / line-scan,</w:t>
-      </w:r>
-      <w:r>
-        <w:t xml:space="preserve"> </w:t>
-      </w:r>
-      <w:r>
-        <w:t xml:space="preserve">and that is our recurring failure class: a regex misses a syntactic variant, so</w:t>
-      </w:r>
-      <w:r>
-        <w:t xml:space="preserve"> </w:t>
-      </w:r>
-      <w:r>
-        <w:t xml:space="preserve">"local clean" diverges from reality (</w:t>
-      </w:r>
-      <w:r>
-        <w:rPr>
-          <w:rStyle w:val="VerbatimChar"/>
-        </w:rPr>
-        <w:t xml:space="preserve">feedback_lint_gate_cover_all_syntactic_forms</w:t>
-      </w:r>
-      <w:r>
-        <w:t xml:space="preserve">,</w:t>
-      </w:r>
-      <w:r>
-        <w:t xml:space="preserve"> </w:t>
-      </w:r>
-      <w:r>
-        <w:t xml:space="preserve">the nine-issue</w:t>
-      </w:r>
-      <w:r>
-        <w:t xml:space="preserve"> </w:t>
-      </w:r>
-      <w:r>
-        <w:rPr>
-          <w:rStyle w:val="VerbatimChar"/>
-        </w:rPr>
-        <w:t xml:space="preserve">_shell_parse.py</w:t>
-      </w:r>
-      <w:r>
-        <w:t xml:space="preserve"> </w:t>
-      </w:r>
-      <w:r>
-        <w:t xml:space="preserve">bug trail). Structural tools match the</w:t>
-      </w:r>
-      <w:r>
-        <w:t xml:space="preserve"> </w:t>
-      </w:r>
-      <w:r>
-        <w:rPr>
+        <w:t xml:space="preserve">For literal / line-oriented text search we standardize on</w:t>
+      </w:r>
+      <w:r>
+        <w:t xml:space="preserve"> </w:t>
+      </w:r>
+      <w:r>
+        <w:rPr>
+          <w:rStyle w:val="VerbatimChar"/>
           <w:b/>
           <w:bCs/>
         </w:rPr>
-        <w:t xml:space="preserve">syntax</w:t>
+        <w:t xml:space="preserve">rg</w:t>
       </w:r>
       <w:r>
         <w:rPr>
@@ -3176,16 +3524,110 @@
           <w:b/>
           <w:bCs/>
         </w:rPr>
-        <w:t xml:space="preserve">tree</w:t>
-      </w:r>
-      <w:r>
-        <w:t xml:space="preserve">, not the text, so they are correct-by-construction for structure-dependent</w:t>
-      </w:r>
-      <w:r>
-        <w:t xml:space="preserve"> </w:t>
-      </w:r>
-      <w:r>
-        <w:t xml:space="preserve">work.</w:t>
+        <w:t xml:space="preserve">(ripgrep)</w:t>
+      </w:r>
+      <w:r>
+        <w:t xml:space="preserve"> </w:t>
+      </w:r>
+      <w:r>
+        <w:t xml:space="preserve">and</w:t>
+      </w:r>
+      <w:r>
+        <w:t xml:space="preserve"> </w:t>
+      </w:r>
+      <w:r>
+        <w:rPr>
+          <w:b/>
+          <w:bCs/>
+        </w:rPr>
+        <w:t xml:space="preserve">never plain</w:t>
+      </w:r>
+      <w:r>
+        <w:rPr>
+          <w:b/>
+          <w:bCs/>
+        </w:rPr>
+        <w:t xml:space="preserve"> </w:t>
+      </w:r>
+      <w:r>
+        <w:rPr>
+          <w:rStyle w:val="VerbatimChar"/>
+          <w:b/>
+          <w:bCs/>
+        </w:rPr>
+        <w:t xml:space="preserve">grep</w:t>
+      </w:r>
+      <w:r>
+        <w:t xml:space="preserve">. A bare</w:t>
+      </w:r>
+      <w:r>
+        <w:t xml:space="preserve"> </w:t>
+      </w:r>
+      <w:r>
+        <w:rPr>
+          <w:rStyle w:val="VerbatimChar"/>
+        </w:rPr>
+        <w:t xml:space="preserve">grep</w:t>
+      </w:r>
+      <w:r>
+        <w:t xml:space="preserve"> </w:t>
+      </w:r>
+      <w:r>
+        <w:t xml:space="preserve">invocation from the agent Bash tool is</w:t>
+      </w:r>
+      <w:r>
+        <w:t xml:space="preserve"> </w:t>
+      </w:r>
+      <w:r>
+        <w:rPr>
+          <w:b/>
+          <w:bCs/>
+        </w:rPr>
+        <w:t xml:space="preserve">hard-blocked</w:t>
+      </w:r>
+      <w:r>
+        <w:t xml:space="preserve"> </w:t>
+      </w:r>
+      <w:r>
+        <w:t xml:space="preserve">by a PreToolUse hook</w:t>
+      </w:r>
+      <w:r>
+        <w:t xml:space="preserve"> </w:t>
+      </w:r>
+      <w:r>
+        <w:t xml:space="preserve">(</w:t>
+      </w:r>
+      <w:hyperlink r:id="rId17">
+        <w:r>
+          <w:rPr>
+            <w:rStyle w:val="Hyperlink"/>
+          </w:rPr>
+          <w:t xml:space="preserve">#1008</w:t>
+        </w:r>
+      </w:hyperlink>
+      <w:r>
+        <w:t xml:space="preserve">); committed</w:t>
+      </w:r>
+      <w:r>
+        <w:t xml:space="preserve"> </w:t>
+      </w:r>
+      <w:r>
+        <w:t xml:space="preserve">scripts, hooks, and skill bash-blocks use</w:t>
+      </w:r>
+      <w:r>
+        <w:t xml:space="preserve"> </w:t>
+      </w:r>
+      <w:r>
+        <w:rPr>
+          <w:rStyle w:val="VerbatimChar"/>
+        </w:rPr>
+        <w:t xml:space="preserve">rg</w:t>
+      </w:r>
+      <w:r>
+        <w:t xml:space="preserve"> </w:t>
+      </w:r>
+      <w:r>
+        <w:t xml:space="preserve">too, and CI provisions it.</w:t>
       </w:r>
     </w:p>
     <w:p>
@@ -3193,23 +3635,122 @@
         <w:pStyle w:val="BodyText"/>
       </w:pPr>
       <w:r>
-        <w:rPr>
+        <w:t xml:space="preserve">Why:</w:t>
+      </w:r>
+      <w:r>
+        <w:t xml:space="preserve"> </w:t>
+      </w:r>
+      <w:r>
+        <w:rPr>
+          <w:rStyle w:val="VerbatimChar"/>
+        </w:rPr>
+        <w:t xml:space="preserve">rg</w:t>
+      </w:r>
+      <w:r>
+        <w:t xml:space="preserve"> </w:t>
+      </w:r>
+      <w:r>
+        <w:t xml:space="preserve">is faster, multiline-capable, and skips VCS-ignored noise by default;</w:t>
+      </w:r>
+      <w:r>
+        <w:t xml:space="preserve"> </w:t>
+      </w:r>
+      <w:r>
+        <w:t xml:space="preserve">and on the dev box</w:t>
+      </w:r>
+      <w:r>
+        <w:t xml:space="preserve"> </w:t>
+      </w:r>
+      <w:r>
+        <w:rPr>
+          <w:rStyle w:val="VerbatimChar"/>
+        </w:rPr>
+        <w:t xml:space="preserve">grep</w:t>
+      </w:r>
+      <w:r>
+        <w:t xml:space="preserve"> </w:t>
+      </w:r>
+      <w:r>
+        <w:t xml:space="preserve">is actually</w:t>
+      </w:r>
+      <w:r>
+        <w:t xml:space="preserve"> </w:t>
+      </w:r>
+      <w:r>
+        <w:rPr>
+          <w:rStyle w:val="VerbatimChar"/>
           <w:b/>
           <w:bCs/>
         </w:rPr>
-        <w:t xml:space="preserve">Rule of thumb:</w:t>
-      </w:r>
-      <w:r>
-        <w:t xml:space="preserve"> </w:t>
-      </w:r>
-      <w:r>
-        <w:t xml:space="preserve">reach for a structural tool when the thing you're matching</w:t>
-      </w:r>
-      <w:r>
-        <w:t xml:space="preserve"> </w:t>
-      </w:r>
-      <w:r>
-        <w:t xml:space="preserve">depends on code/markup</w:t>
+        <w:t xml:space="preserve">ugrep</w:t>
+      </w:r>
+      <w:r>
+        <w:t xml:space="preserve">, not GNU grep, so relying on</w:t>
+      </w:r>
+      <w:r>
+        <w:t xml:space="preserve"> </w:t>
+      </w:r>
+      <w:r>
+        <w:t xml:space="preserve">GNU-grep behavior is already unsafe.</w:t>
+      </w:r>
+    </w:p>
+    <w:p>
+      <w:pPr>
+        <w:pStyle w:val="BodyText"/>
+      </w:pPr>
+      <w:r>
+        <w:t xml:space="preserve">Two gotchas the rule carries:</w:t>
+      </w:r>
+    </w:p>
+    <w:p>
+      <w:pPr>
+        <w:pStyle w:val="Compact"/>
+        <w:numPr>
+          <w:ilvl w:val="0"/>
+          <w:numId w:val="1002"/>
+        </w:numPr>
+      </w:pPr>
+      <w:r>
+        <w:rPr>
+          <w:rStyle w:val="VerbatimChar"/>
+          <w:b/>
+          <w:bCs/>
+        </w:rPr>
+        <w:t xml:space="preserve">.gitignore</w:t>
+      </w:r>
+      <w:r>
+        <w:rPr>
+          <w:b/>
+          <w:bCs/>
+        </w:rPr>
+        <w:t xml:space="preserve">-awareness is a foot-gun for generated targets.</w:t>
+      </w:r>
+      <w:r>
+        <w:t xml:space="preserve"> </w:t>
+      </w:r>
+      <w:r>
+        <w:rPr>
+          <w:rStyle w:val="VerbatimChar"/>
+        </w:rPr>
+        <w:t xml:space="preserve">rg</w:t>
+      </w:r>
+      <w:r>
+        <w:t xml:space="preserve"> </w:t>
+      </w:r>
+      <w:r>
+        <w:t xml:space="preserve">skips</w:t>
+      </w:r>
+      <w:r>
+        <w:t xml:space="preserve"> </w:t>
+      </w:r>
+      <w:r>
+        <w:rPr>
+          <w:rStyle w:val="VerbatimChar"/>
+        </w:rPr>
+        <w:t xml:space="preserve">.gitignore</w:t>
+      </w:r>
+      <w:r>
+        <w:t xml:space="preserve">d paths</w:t>
       </w:r>
       <w:r>
         <w:t xml:space="preserve"> </w:t>
@@ -3219,19 +3760,187 @@
           <w:i/>
           <w:iCs/>
         </w:rPr>
-        <w:t xml:space="preserve">structure</w:t>
-      </w:r>
-      <w:r>
-        <w:t xml:space="preserve"> </w:t>
-      </w:r>
-      <w:r>
-        <w:t xml:space="preserve">(a call form, a YAML key path, an AST node);</w:t>
-      </w:r>
-      <w:r>
-        <w:t xml:space="preserve"> </w:t>
-      </w:r>
-      <w:r>
-        <w:t xml:space="preserve">keep</w:t>
+        <w:t xml:space="preserve">by default</w:t>
+      </w:r>
+      <w:r>
+        <w:t xml:space="preserve">, so searching a generated/ignored target —</w:t>
+      </w:r>
+      <w:r>
+        <w:t xml:space="preserve"> </w:t>
+      </w:r>
+      <w:r>
+        <w:t xml:space="preserve">e.g. the</w:t>
+      </w:r>
+      <w:r>
+        <w:t xml:space="preserve"> </w:t>
+      </w:r>
+      <w:r>
+        <w:rPr>
+          <w:rStyle w:val="VerbatimChar"/>
+        </w:rPr>
+        <w:t xml:space="preserve">ontology/structural/</w:t>
+      </w:r>
+      <w:r>
+        <w:t xml:space="preserve"> </w:t>
+      </w:r>
+      <w:r>
+        <w:t xml:space="preserve">index,</w:t>
+      </w:r>
+      <w:r>
+        <w:t xml:space="preserve"> </w:t>
+      </w:r>
+      <w:r>
+        <w:rPr>
+          <w:rStyle w:val="VerbatimChar"/>
+        </w:rPr>
+        <w:t xml:space="preserve">dist/</w:t>
+      </w:r>
+      <w:r>
+        <w:t xml:space="preserve">, coverage output — silently</w:t>
+      </w:r>
+      <w:r>
+        <w:t xml:space="preserve"> </w:t>
+      </w:r>
+      <w:r>
+        <w:t xml:space="preserve">returns nothing. Add</w:t>
+      </w:r>
+      <w:r>
+        <w:t xml:space="preserve"> </w:t>
+      </w:r>
+      <w:r>
+        <w:rPr>
+          <w:rStyle w:val="VerbatimChar"/>
+          <w:b/>
+          <w:bCs/>
+        </w:rPr>
+        <w:t xml:space="preserve">--no-ignore</w:t>
+      </w:r>
+      <w:r>
+        <w:t xml:space="preserve"> </w:t>
+      </w:r>
+      <w:r>
+        <w:t xml:space="preserve">(or</w:t>
+      </w:r>
+      <w:r>
+        <w:t xml:space="preserve"> </w:t>
+      </w:r>
+      <w:r>
+        <w:rPr>
+          <w:rStyle w:val="VerbatimChar"/>
+        </w:rPr>
+        <w:t xml:space="preserve">-uu</w:t>
+      </w:r>
+      <w:r>
+        <w:t xml:space="preserve">) whenever the thing you're</w:t>
+      </w:r>
+      <w:r>
+        <w:t xml:space="preserve"> </w:t>
+      </w:r>
+      <w:r>
+        <w:t xml:space="preserve">searching can be git-ignored (</w:t>
+      </w:r>
+      <w:r>
+        <w:rPr>
+          <w:rStyle w:val="VerbatimChar"/>
+        </w:rPr>
+        <w:t xml:space="preserve">feedback_silent_zero_is_not_a_measurement</w:t>
+      </w:r>
+      <w:r>
+        <w:t xml:space="preserve">).</w:t>
+      </w:r>
+    </w:p>
+    <w:p>
+      <w:pPr>
+        <w:pStyle w:val="Compact"/>
+        <w:numPr>
+          <w:ilvl w:val="0"/>
+          <w:numId w:val="1002"/>
+        </w:numPr>
+      </w:pPr>
+      <w:r>
+        <w:rPr>
+          <w:b/>
+          <w:bCs/>
+        </w:rPr>
+        <w:t xml:space="preserve">Flag translation.</w:t>
+      </w:r>
+      <w:r>
+        <w:t xml:space="preserve"> </w:t>
+      </w:r>
+      <w:r>
+        <w:rPr>
+          <w:rStyle w:val="VerbatimChar"/>
+        </w:rPr>
+        <w:t xml:space="preserve">grep -r pat path</w:t>
+      </w:r>
+      <w:r>
+        <w:t xml:space="preserve"> </w:t>
+      </w:r>
+      <w:r>
+        <w:t xml:space="preserve">→</w:t>
+      </w:r>
+      <w:r>
+        <w:t xml:space="preserve"> </w:t>
+      </w:r>
+      <w:r>
+        <w:rPr>
+          <w:rStyle w:val="VerbatimChar"/>
+        </w:rPr>
+        <w:t xml:space="preserve">rg pat path</w:t>
+      </w:r>
+      <w:r>
+        <w:t xml:space="preserve"> </w:t>
+      </w:r>
+      <w:r>
+        <w:t xml:space="preserve">(recursive by</w:t>
+      </w:r>
+      <w:r>
+        <w:t xml:space="preserve"> </w:t>
+      </w:r>
+      <w:r>
+        <w:t xml:space="preserve">default);</w:t>
+      </w:r>
+      <w:r>
+        <w:t xml:space="preserve"> </w:t>
+      </w:r>
+      <w:r>
+        <w:rPr>
+          <w:rStyle w:val="VerbatimChar"/>
+        </w:rPr>
+        <w:t xml:space="preserve">grep -rn</w:t>
+      </w:r>
+      <w:r>
+        <w:t xml:space="preserve"> </w:t>
+      </w:r>
+      <w:r>
+        <w:t xml:space="preserve">→</w:t>
+      </w:r>
+      <w:r>
+        <w:t xml:space="preserve"> </w:t>
+      </w:r>
+      <w:r>
+        <w:rPr>
+          <w:rStyle w:val="VerbatimChar"/>
+        </w:rPr>
+        <w:t xml:space="preserve">rg -n</w:t>
+      </w:r>
+      <w:r>
+        <w:t xml:space="preserve">;</w:t>
+      </w:r>
+      <w:r>
+        <w:t xml:space="preserve"> </w:t>
+      </w:r>
+      <w:r>
+        <w:rPr>
+          <w:rStyle w:val="VerbatimChar"/>
+        </w:rPr>
+        <w:t xml:space="preserve">grep -E</w:t>
+      </w:r>
+      <w:r>
+        <w:t xml:space="preserve"> </w:t>
+      </w:r>
+      <w:r>
+        <w:t xml:space="preserve">→</w:t>
       </w:r>
       <w:r>
         <w:t xml:space="preserve"> </w:t>
@@ -3243,28 +3952,289 @@
         <w:t xml:space="preserve">rg</w:t>
       </w:r>
       <w:r>
-        <w:t xml:space="preserve">/</w:t>
-      </w:r>
-      <w:r>
-        <w:rPr>
-          <w:rStyle w:val="VerbatimChar"/>
-        </w:rPr>
-        <w:t xml:space="preserve">sed</w:t>
-      </w:r>
-      <w:r>
-        <w:t xml:space="preserve">/</w:t>
-      </w:r>
-      <w:r>
-        <w:rPr>
-          <w:rStyle w:val="VerbatimChar"/>
-        </w:rPr>
-        <w:t xml:space="preserve">sd</w:t>
-      </w:r>
-      <w:r>
-        <w:t xml:space="preserve"> </w:t>
-      </w:r>
-      <w:r>
-        <w:t xml:space="preserve">for</w:t>
+        <w:t xml:space="preserve"> </w:t>
+      </w:r>
+      <w:r>
+        <w:t xml:space="preserve">(regex by default);</w:t>
+      </w:r>
+      <w:r>
+        <w:t xml:space="preserve"> </w:t>
+      </w:r>
+      <w:r>
+        <w:rPr>
+          <w:rStyle w:val="VerbatimChar"/>
+        </w:rPr>
+        <w:t xml:space="preserve">grep -F</w:t>
+      </w:r>
+      <w:r>
+        <w:t xml:space="preserve"> </w:t>
+      </w:r>
+      <w:r>
+        <w:t xml:space="preserve">→</w:t>
+      </w:r>
+      <w:r>
+        <w:t xml:space="preserve"> </w:t>
+      </w:r>
+      <w:r>
+        <w:rPr>
+          <w:rStyle w:val="VerbatimChar"/>
+        </w:rPr>
+        <w:t xml:space="preserve">rg -F</w:t>
+      </w:r>
+      <w:r>
+        <w:t xml:space="preserve">;</w:t>
+      </w:r>
+      <w:r>
+        <w:t xml:space="preserve"> </w:t>
+      </w:r>
+      <w:r>
+        <w:rPr>
+          <w:rStyle w:val="VerbatimChar"/>
+        </w:rPr>
+        <w:t xml:space="preserve">grep -o</w:t>
+      </w:r>
+      <w:r>
+        <w:t xml:space="preserve"> </w:t>
+      </w:r>
+      <w:r>
+        <w:t xml:space="preserve">→</w:t>
+      </w:r>
+      <w:r>
+        <w:t xml:space="preserve"> </w:t>
+      </w:r>
+      <w:r>
+        <w:rPr>
+          <w:rStyle w:val="VerbatimChar"/>
+        </w:rPr>
+        <w:t xml:space="preserve">rg -o</w:t>
+      </w:r>
+      <w:r>
+        <w:t xml:space="preserve">;</w:t>
+      </w:r>
+      <w:r>
+        <w:t xml:space="preserve"> </w:t>
+      </w:r>
+      <w:r>
+        <w:rPr>
+          <w:rStyle w:val="VerbatimChar"/>
+        </w:rPr>
+        <w:t xml:space="preserve">grep -c/-l/-v/-i/-w/-q</w:t>
+      </w:r>
+      <w:r>
+        <w:t xml:space="preserve"> </w:t>
+      </w:r>
+      <w:r>
+        <w:t xml:space="preserve">map 1:1. Piped</w:t>
+      </w:r>
+      <w:r>
+        <w:t xml:space="preserve"> </w:t>
+      </w:r>
+      <w:r>
+        <w:rPr>
+          <w:rStyle w:val="VerbatimChar"/>
+        </w:rPr>
+        <w:t xml:space="preserve">… | grep pat</w:t>
+      </w:r>
+      <w:r>
+        <w:t xml:space="preserve"> </w:t>
+      </w:r>
+      <w:r>
+        <w:t xml:space="preserve">→</w:t>
+      </w:r>
+      <w:r>
+        <w:t xml:space="preserve"> </w:t>
+      </w:r>
+      <w:r>
+        <w:rPr>
+          <w:rStyle w:val="VerbatimChar"/>
+        </w:rPr>
+        <w:t xml:space="preserve">… | rg pat</w:t>
+      </w:r>
+      <w:r>
+        <w:t xml:space="preserve">.</w:t>
+      </w:r>
+    </w:p>
+    <w:p>
+      <w:pPr>
+        <w:pStyle w:val="Compact"/>
+        <w:numPr>
+          <w:ilvl w:val="0"/>
+          <w:numId w:val="1002"/>
+        </w:numPr>
+      </w:pPr>
+      <w:r>
+        <w:rPr>
+          <w:b/>
+          <w:bCs/>
+        </w:rPr>
+        <w:t xml:space="preserve">Override for genuine grep-only needs:</w:t>
+      </w:r>
+      <w:r>
+        <w:t xml:space="preserve"> </w:t>
+      </w:r>
+      <w:r>
+        <w:t xml:space="preserve">prefix the command with</w:t>
+      </w:r>
+      <w:r>
+        <w:t xml:space="preserve"> </w:t>
+      </w:r>
+      <w:r>
+        <w:rPr>
+          <w:rStyle w:val="VerbatimChar"/>
+        </w:rPr>
+        <w:t xml:space="preserve">NOORINA_ALLOW_GREP=1</w:t>
+      </w:r>
+      <w:r>
+        <w:t xml:space="preserve"> </w:t>
+      </w:r>
+      <w:r>
+        <w:t xml:space="preserve">(documented escape hatch for the rare case</w:t>
+      </w:r>
+      <w:r>
+        <w:t xml:space="preserve"> </w:t>
+      </w:r>
+      <w:r>
+        <w:rPr>
+          <w:rStyle w:val="VerbatimChar"/>
+        </w:rPr>
+        <w:t xml:space="preserve">rg</w:t>
+      </w:r>
+      <w:r>
+        <w:t xml:space="preserve"> </w:t>
+      </w:r>
+      <w:r>
+        <w:t xml:space="preserve">can't</w:t>
+      </w:r>
+      <w:r>
+        <w:t xml:space="preserve"> </w:t>
+      </w:r>
+      <w:r>
+        <w:t xml:space="preserve">express) — the block hook honours it.</w:t>
+      </w:r>
+    </w:p>
+    <w:p>
+      <w:pPr>
+        <w:pStyle w:val="FirstParagraph"/>
+      </w:pPr>
+      <w:r>
+        <w:t xml:space="preserve">Structural (AST-dependent) search is a different tool again — see below.</w:t>
+      </w:r>
+    </w:p>
+    <w:bookmarkEnd w:id="18"/>
+    <w:bookmarkStart w:id="22" w:name="structural--ast-tooling"/>
+    <w:p>
+      <w:pPr>
+        <w:pStyle w:val="Heading2"/>
+      </w:pPr>
+      <w:r>
+        <w:t xml:space="preserve">Structural &amp; AST tooling</w:t>
+      </w:r>
+    </w:p>
+    <w:p>
+      <w:pPr>
+        <w:pStyle w:val="FirstParagraph"/>
+      </w:pPr>
+      <w:r>
+        <w:t xml:space="preserve">Every code/YAML/shell-scanning gate we run today is Python regex / line-scan,</w:t>
+      </w:r>
+      <w:r>
+        <w:t xml:space="preserve"> </w:t>
+      </w:r>
+      <w:r>
+        <w:t xml:space="preserve">and that is our recurring failure class: a regex misses a syntactic variant, so</w:t>
+      </w:r>
+      <w:r>
+        <w:t xml:space="preserve"> </w:t>
+      </w:r>
+      <w:r>
+        <w:t xml:space="preserve">"local clean" diverges from reality (</w:t>
+      </w:r>
+      <w:r>
+        <w:rPr>
+          <w:rStyle w:val="VerbatimChar"/>
+        </w:rPr>
+        <w:t xml:space="preserve">feedback_lint_gate_cover_all_syntactic_forms</w:t>
+      </w:r>
+      <w:r>
+        <w:t xml:space="preserve">,</w:t>
+      </w:r>
+      <w:r>
+        <w:t xml:space="preserve"> </w:t>
+      </w:r>
+      <w:r>
+        <w:t xml:space="preserve">the nine-issue</w:t>
+      </w:r>
+      <w:r>
+        <w:t xml:space="preserve"> </w:t>
+      </w:r>
+      <w:r>
+        <w:rPr>
+          <w:rStyle w:val="VerbatimChar"/>
+        </w:rPr>
+        <w:t xml:space="preserve">_shell_parse.py</w:t>
+      </w:r>
+      <w:r>
+        <w:t xml:space="preserve"> </w:t>
+      </w:r>
+      <w:r>
+        <w:t xml:space="preserve">bug trail). Structural tools match the</w:t>
+      </w:r>
+      <w:r>
+        <w:t xml:space="preserve"> </w:t>
+      </w:r>
+      <w:r>
+        <w:rPr>
+          <w:b/>
+          <w:bCs/>
+        </w:rPr>
+        <w:t xml:space="preserve">syntax</w:t>
+      </w:r>
+      <w:r>
+        <w:rPr>
+          <w:b/>
+          <w:bCs/>
+        </w:rPr>
+        <w:t xml:space="preserve"> </w:t>
+      </w:r>
+      <w:r>
+        <w:rPr>
+          <w:b/>
+          <w:bCs/>
+        </w:rPr>
+        <w:t xml:space="preserve">tree</w:t>
+      </w:r>
+      <w:r>
+        <w:t xml:space="preserve">, not the text, so they are correct-by-construction for structure-dependent</w:t>
+      </w:r>
+      <w:r>
+        <w:t xml:space="preserve"> </w:t>
+      </w:r>
+      <w:r>
+        <w:t xml:space="preserve">work.</w:t>
+      </w:r>
+    </w:p>
+    <w:p>
+      <w:pPr>
+        <w:pStyle w:val="BodyText"/>
+      </w:pPr>
+      <w:r>
+        <w:rPr>
+          <w:b/>
+          <w:bCs/>
+        </w:rPr>
+        <w:t xml:space="preserve">Rule of thumb:</w:t>
+      </w:r>
+      <w:r>
+        <w:t xml:space="preserve"> </w:t>
+      </w:r>
+      <w:r>
+        <w:t xml:space="preserve">reach for a structural tool when the thing you're matching</w:t>
+      </w:r>
+      <w:r>
+        <w:t xml:space="preserve"> </w:t>
+      </w:r>
+      <w:r>
+        <w:t xml:space="preserve">depends on code/markup</w:t>
       </w:r>
       <w:r>
         <w:t xml:space="preserve"> </w:t>
@@ -3274,6 +4244,61 @@
           <w:i/>
           <w:iCs/>
         </w:rPr>
+        <w:t xml:space="preserve">structure</w:t>
+      </w:r>
+      <w:r>
+        <w:t xml:space="preserve"> </w:t>
+      </w:r>
+      <w:r>
+        <w:t xml:space="preserve">(a call form, a YAML key path, an AST node);</w:t>
+      </w:r>
+      <w:r>
+        <w:t xml:space="preserve"> </w:t>
+      </w:r>
+      <w:r>
+        <w:t xml:space="preserve">keep</w:t>
+      </w:r>
+      <w:r>
+        <w:t xml:space="preserve"> </w:t>
+      </w:r>
+      <w:r>
+        <w:rPr>
+          <w:rStyle w:val="VerbatimChar"/>
+        </w:rPr>
+        <w:t xml:space="preserve">rg</w:t>
+      </w:r>
+      <w:r>
+        <w:t xml:space="preserve">/</w:t>
+      </w:r>
+      <w:r>
+        <w:rPr>
+          <w:rStyle w:val="VerbatimChar"/>
+        </w:rPr>
+        <w:t xml:space="preserve">sed</w:t>
+      </w:r>
+      <w:r>
+        <w:t xml:space="preserve">/</w:t>
+      </w:r>
+      <w:r>
+        <w:rPr>
+          <w:rStyle w:val="VerbatimChar"/>
+        </w:rPr>
+        <w:t xml:space="preserve">sd</w:t>
+      </w:r>
+      <w:r>
+        <w:t xml:space="preserve"> </w:t>
+      </w:r>
+      <w:r>
+        <w:t xml:space="preserve">for</w:t>
+      </w:r>
+      <w:r>
+        <w:t xml:space="preserve"> </w:t>
+      </w:r>
+      <w:r>
+        <w:rPr>
+          <w:i/>
+          <w:iCs/>
+        </w:rPr>
         <w:t xml:space="preserve">literal</w:t>
       </w:r>
       <w:r>
@@ -3283,7 +4308,7 @@
         <w:t xml:space="preserve">/ line-oriented work.</w:t>
       </w:r>
     </w:p>
-    <w:bookmarkStart w:id="17" w:name="Xc63448566dd6131b41b1182a291f300dd75089b"/>
+    <w:bookmarkStart w:id="19" w:name="Xc63448566dd6131b41b1182a291f300dd75089b"/>
     <w:p>
       <w:pPr>
         <w:pStyle w:val="Heading3"/>
@@ -4093,8 +5118,8 @@
         <w:t xml:space="preserve">line breaks don't defeat the match the way they defeat a regex.</w:t>
       </w:r>
     </w:p>
-    <w:bookmarkEnd w:id="17"/>
-    <w:bookmarkStart w:id="18" w:name="X58a1693b4a3294265f8884298eb187ba5e5ba20"/>
+    <w:bookmarkEnd w:id="19"/>
+    <w:bookmarkStart w:id="20" w:name="X58a1693b4a3294265f8884298eb187ba5e5ba20"/>
     <w:p>
       <w:pPr>
         <w:pStyle w:val="Heading3"/>
@@ -4648,8 +5673,8 @@
         </w:tc>
       </w:tr>
     </w:tbl>
-    <w:bookmarkEnd w:id="18"/>
-    <w:bookmarkStart w:id="19" w:name="Xecf10dddf5aec931c01be495daa582d7751f6e2"/>
+    <w:bookmarkEnd w:id="20"/>
+    <w:bookmarkStart w:id="21" w:name="Xecf10dddf5aec931c01be495daa582d7751f6e2"/>
     <w:p>
       <w:pPr>
         <w:pStyle w:val="Heading3"/>
@@ -4785,7 +5810,7 @@
       <w:pPr>
         <w:numPr>
           <w:ilvl w:val="0"/>
-          <w:numId w:val="1002"/>
+          <w:numId w:val="1003"/>
         </w:numPr>
       </w:pPr>
       <w:r>
@@ -4866,7 +5891,7 @@
       <w:pPr>
         <w:numPr>
           <w:ilvl w:val="0"/>
-          <w:numId w:val="1002"/>
+          <w:numId w:val="1003"/>
         </w:numPr>
       </w:pPr>
       <w:r>
@@ -5248,9 +6273,9 @@
         </w:pict>
       </w:r>
     </w:p>
-    <w:bookmarkEnd w:id="19"/>
-    <w:bookmarkEnd w:id="20"/>
-    <w:bookmarkStart w:id="24" w:name="document-generation-markdown--ms-office"/>
+    <w:bookmarkEnd w:id="21"/>
+    <w:bookmarkEnd w:id="22"/>
+    <w:bookmarkStart w:id="26" w:name="document-generation-markdown--ms-office"/>
     <w:p>
       <w:pPr>
         <w:pStyle w:val="Heading2"/>
@@ -5333,7 +6358,7 @@
       <w:r>
         <w:t xml:space="preserve">(</w:t>
       </w:r>
-      <w:hyperlink r:id="rId21">
+      <w:hyperlink r:id="rId23">
         <w:r>
           <w:rPr>
             <w:rStyle w:val="Hyperlink"/>
@@ -5353,7 +6378,7 @@
       <w:r>
         <w:t xml:space="preserve"> </w:t>
       </w:r>
-      <w:hyperlink r:id="rId22">
+      <w:hyperlink r:id="rId24">
         <w:r>
           <w:rPr>
             <w:rStyle w:val="VerbatimChar"/>
@@ -5373,7 +6398,7 @@
       <w:r>
         <w:t xml:space="preserve"> </w:t>
       </w:r>
-      <w:hyperlink r:id="rId23">
+      <w:hyperlink r:id="rId25">
         <w:r>
           <w:rPr>
             <w:rStyle w:val="VerbatimChar"/>
@@ -5873,8 +6898,8 @@
         </w:pict>
       </w:r>
     </w:p>
-    <w:bookmarkEnd w:id="24"/>
-    <w:bookmarkStart w:id="26" w:name="see-also"/>
+    <w:bookmarkEnd w:id="26"/>
+    <w:bookmarkStart w:id="28" w:name="see-also"/>
     <w:p>
       <w:pPr>
         <w:pStyle w:val="Heading2"/>
@@ -5888,7 +6913,7 @@
         <w:pStyle w:val="Compact"/>
         <w:numPr>
           <w:ilvl w:val="0"/>
-          <w:numId w:val="1003"/>
+          <w:numId w:val="1004"/>
         </w:numPr>
       </w:pPr>
       <w:hyperlink r:id="rId12">
@@ -5923,10 +6948,10 @@
         <w:pStyle w:val="Compact"/>
         <w:numPr>
           <w:ilvl w:val="0"/>
-          <w:numId w:val="1003"/>
+          <w:numId w:val="1004"/>
         </w:numPr>
       </w:pPr>
-      <w:hyperlink r:id="rId25">
+      <w:hyperlink r:id="rId27">
         <w:r>
           <w:rPr>
             <w:rStyle w:val="VerbatimChar"/>
@@ -5952,7 +6977,7 @@
         <w:pStyle w:val="Compact"/>
         <w:numPr>
           <w:ilvl w:val="0"/>
-          <w:numId w:val="1003"/>
+          <w:numId w:val="1004"/>
         </w:numPr>
       </w:pPr>
       <w:r>
@@ -5968,8 +6993,8 @@
         <w:t xml:space="preserve">— the originating memory.</w:t>
       </w:r>
     </w:p>
-    <w:bookmarkEnd w:id="26"/>
-    <w:bookmarkEnd w:id="27"/>
+    <w:bookmarkEnd w:id="28"/>
+    <w:bookmarkEnd w:id="29"/>
     <w:sectPr>
       <w:footnotePr>
         <w:numRestart w:val="eachSect"/>
@@ -6275,6 +7300,9 @@
     <w:abstractNumId w:val="991"/>
   </w:num>
   <w:num w:numId="1002">
+    <w:abstractNumId w:val="991"/>
+  </w:num>
+  <w:num w:numId="1003">
     <w:abstractNumId w:val="99411"/>
     <w:lvlOverride w:ilvl="0">
       <w:startOverride w:val="1"/>
@@ -6304,7 +7332,7 @@
       <w:startOverride w:val="1"/>
     </w:lvlOverride>
   </w:num>
-  <w:num w:numId="1003">
+  <w:num w:numId="1004">
     <w:abstractNumId w:val="991"/>
   </w:num>
 </w:numbering>

</xml_diff>

<commit_message>
docs(#1051): document the rg --hidden gotcha alongside --no-ignore
`rg` skips hidden files/dirs by default, independently of `.gitignore` —
a separate foot-gun `--no-ignore` doesn't cover. Since this org's entire
config/enforcement tree lives under the hidden `.claude/`, a recursive
`rg` search silently returns zero matches there even with `--no-ignore`
added. Documents `--hidden`/`-uu` as the fix in docs/TOOLCHAIN.md §
Text search and mirrors the note into ontology/conventions.md, alongside
the existing --no-ignore gotcha. docs/office/TOOLCHAIN.docx regenerated
by the office-drift pre-push hook to match.

Co-Authored-By: Claude Opus 4.8 (1M context) <noreply@anthropic.com>
Claude-Session: https://claude.ai/code/session_018KeNK3VBB3zFyJWxUGWM7z
</commit_message>
<xml_diff>
--- a/docs/office/TOOLCHAIN.docx
+++ b/docs/office/TOOLCHAIN.docx
@@ -3847,6 +3847,556 @@
       </w:r>
       <w:r>
         <w:t xml:space="preserve">).</w:t>
+      </w:r>
+    </w:p>
+    <w:p>
+      <w:pPr>
+        <w:pStyle w:val="Compact"/>
+        <w:numPr>
+          <w:ilvl w:val="0"/>
+          <w:numId w:val="1002"/>
+        </w:numPr>
+      </w:pPr>
+      <w:r>
+        <w:rPr>
+          <w:b/>
+          <w:bCs/>
+        </w:rPr>
+        <w:t xml:space="preserve">Hidden-directory-awareness is a second, separate foot-gun —</w:t>
+      </w:r>
+      <w:r>
+        <w:rPr>
+          <w:b/>
+          <w:bCs/>
+        </w:rPr>
+        <w:t xml:space="preserve"> </w:t>
+      </w:r>
+      <w:r>
+        <w:rPr>
+          <w:rStyle w:val="VerbatimChar"/>
+          <w:b/>
+          <w:bCs/>
+        </w:rPr>
+        <w:t xml:space="preserve">--no-ignore</w:t>
+      </w:r>
+      <w:r>
+        <w:rPr>
+          <w:b/>
+          <w:bCs/>
+        </w:rPr>
+        <w:t xml:space="preserve"> </w:t>
+      </w:r>
+      <w:r>
+        <w:rPr>
+          <w:b/>
+          <w:bCs/>
+        </w:rPr>
+        <w:t xml:space="preserve">does not cover it.</w:t>
+      </w:r>
+      <w:r>
+        <w:t xml:space="preserve"> </w:t>
+      </w:r>
+      <w:r>
+        <w:rPr>
+          <w:rStyle w:val="VerbatimChar"/>
+        </w:rPr>
+        <w:t xml:space="preserve">rg</w:t>
+      </w:r>
+      <w:r>
+        <w:t xml:space="preserve"> </w:t>
+      </w:r>
+      <w:r>
+        <w:t xml:space="preserve">also skips</w:t>
+      </w:r>
+      <w:r>
+        <w:t xml:space="preserve"> </w:t>
+      </w:r>
+      <w:r>
+        <w:rPr>
+          <w:b/>
+          <w:bCs/>
+        </w:rPr>
+        <w:t xml:space="preserve">hidden</w:t>
+      </w:r>
+      <w:r>
+        <w:t xml:space="preserve"> </w:t>
+      </w:r>
+      <w:r>
+        <w:t xml:space="preserve">files and directories by</w:t>
+      </w:r>
+      <w:r>
+        <w:t xml:space="preserve"> </w:t>
+      </w:r>
+      <w:r>
+        <w:t xml:space="preserve">default, independently of</w:t>
+      </w:r>
+      <w:r>
+        <w:t xml:space="preserve"> </w:t>
+      </w:r>
+      <w:r>
+        <w:rPr>
+          <w:rStyle w:val="VerbatimChar"/>
+        </w:rPr>
+        <w:t xml:space="preserve">.gitignore</w:t>
+      </w:r>
+      <w:r>
+        <w:t xml:space="preserve">. This org keeps its entire</w:t>
+      </w:r>
+      <w:r>
+        <w:t xml:space="preserve"> </w:t>
+      </w:r>
+      <w:r>
+        <w:t xml:space="preserve">configuration/enforcement tree — hooks, lib, skills, roster, agents, memory —</w:t>
+      </w:r>
+      <w:r>
+        <w:t xml:space="preserve"> </w:t>
+      </w:r>
+      <w:r>
+        <w:t xml:space="preserve">under</w:t>
+      </w:r>
+      <w:r>
+        <w:t xml:space="preserve"> </w:t>
+      </w:r>
+      <w:r>
+        <w:rPr>
+          <w:rStyle w:val="VerbatimChar"/>
+        </w:rPr>
+        <w:t xml:space="preserve">.claude/</w:t>
+      </w:r>
+      <w:r>
+        <w:t xml:space="preserve">, a hidden directory, so a recursive</w:t>
+      </w:r>
+      <w:r>
+        <w:t xml:space="preserve"> </w:t>
+      </w:r>
+      <w:r>
+        <w:rPr>
+          <w:rStyle w:val="VerbatimChar"/>
+        </w:rPr>
+        <w:t xml:space="preserve">rg</w:t>
+      </w:r>
+      <w:r>
+        <w:t xml:space="preserve"> </w:t>
+      </w:r>
+      <w:r>
+        <w:t xml:space="preserve">from the repo root</w:t>
+      </w:r>
+      <w:r>
+        <w:t xml:space="preserve"> </w:t>
+      </w:r>
+      <w:r>
+        <w:t xml:space="preserve">silently returns</w:t>
+      </w:r>
+      <w:r>
+        <w:t xml:space="preserve"> </w:t>
+      </w:r>
+      <w:r>
+        <w:rPr>
+          <w:b/>
+          <w:bCs/>
+        </w:rPr>
+        <w:t xml:space="preserve">zero matches</w:t>
+      </w:r>
+      <w:r>
+        <w:t xml:space="preserve"> </w:t>
+      </w:r>
+      <w:r>
+        <w:t xml:space="preserve">under</w:t>
+      </w:r>
+      <w:r>
+        <w:t xml:space="preserve"> </w:t>
+      </w:r>
+      <w:r>
+        <w:rPr>
+          <w:rStyle w:val="VerbatimChar"/>
+        </w:rPr>
+        <w:t xml:space="preserve">.claude/</w:t>
+      </w:r>
+      <w:r>
+        <w:t xml:space="preserve"> </w:t>
+      </w:r>
+      <w:r>
+        <w:t xml:space="preserve">even with</w:t>
+      </w:r>
+      <w:r>
+        <w:t xml:space="preserve"> </w:t>
+      </w:r>
+      <w:r>
+        <w:rPr>
+          <w:rStyle w:val="VerbatimChar"/>
+        </w:rPr>
+        <w:t xml:space="preserve">--no-ignore</w:t>
+      </w:r>
+      <w:r>
+        <w:t xml:space="preserve"> </w:t>
+      </w:r>
+      <w:r>
+        <w:t xml:space="preserve">added:</w:t>
+      </w:r>
+    </w:p>
+    <w:p>
+      <w:pPr>
+        <w:pStyle w:val="SourceCode"/>
+        <w:numPr>
+          <w:ilvl w:val="0"/>
+          <w:numId w:val="1000"/>
+        </w:numPr>
+      </w:pPr>
+      <w:r>
+        <w:rPr>
+          <w:rStyle w:val="ExtensionTok"/>
+        </w:rPr>
+        <w:t xml:space="preserve">rg</w:t>
+      </w:r>
+      <w:r>
+        <w:rPr>
+          <w:rStyle w:val="NormalTok"/>
+        </w:rPr>
+        <w:t xml:space="preserve"> </w:t>
+      </w:r>
+      <w:r>
+        <w:rPr>
+          <w:rStyle w:val="AttributeTok"/>
+        </w:rPr>
+        <w:t xml:space="preserve">-n</w:t>
+      </w:r>
+      <w:r>
+        <w:rPr>
+          <w:rStyle w:val="NormalTok"/>
+        </w:rPr>
+        <w:t xml:space="preserve"> </w:t>
+      </w:r>
+      <w:r>
+        <w:rPr>
+          <w:rStyle w:val="AttributeTok"/>
+        </w:rPr>
+        <w:t xml:space="preserve">--no-ignore</w:t>
+      </w:r>
+      <w:r>
+        <w:rPr>
+          <w:rStyle w:val="NormalTok"/>
+        </w:rPr>
+        <w:t xml:space="preserve"> </w:t>
+      </w:r>
+      <w:r>
+        <w:rPr>
+          <w:rStyle w:val="StringTok"/>
+        </w:rPr>
+        <w:t xml:space="preserve">"check_comment_reviews\("</w:t>
+      </w:r>
+      <w:r>
+        <w:rPr>
+          <w:rStyle w:val="NormalTok"/>
+        </w:rPr>
+        <w:t xml:space="preserve"> . </w:t>
+      </w:r>
+      <w:r>
+        <w:rPr>
+          <w:rStyle w:val="AttributeTok"/>
+        </w:rPr>
+        <w:t xml:space="preserve">-g</w:t>
+      </w:r>
+      <w:r>
+        <w:rPr>
+          <w:rStyle w:val="NormalTok"/>
+        </w:rPr>
+        <w:t xml:space="preserve"> </w:t>
+      </w:r>
+      <w:r>
+        <w:rPr>
+          <w:rStyle w:val="StringTok"/>
+        </w:rPr>
+        <w:t xml:space="preserve">'*.py'</w:t>
+      </w:r>
+      <w:r>
+        <w:rPr>
+          <w:rStyle w:val="NormalTok"/>
+        </w:rPr>
+        <w:t xml:space="preserve">          </w:t>
+      </w:r>
+      <w:r>
+        <w:rPr>
+          <w:rStyle w:val="CommentTok"/>
+        </w:rPr>
+        <w:t xml:space="preserve"># 0 matches — silent zero</w:t>
+      </w:r>
+      <w:r>
+        <w:br/>
+      </w:r>
+      <w:r>
+        <w:rPr>
+          <w:rStyle w:val="ExtensionTok"/>
+        </w:rPr>
+        <w:t xml:space="preserve">rg</w:t>
+      </w:r>
+      <w:r>
+        <w:rPr>
+          <w:rStyle w:val="NormalTok"/>
+        </w:rPr>
+        <w:t xml:space="preserve"> </w:t>
+      </w:r>
+      <w:r>
+        <w:rPr>
+          <w:rStyle w:val="AttributeTok"/>
+        </w:rPr>
+        <w:t xml:space="preserve">-n</w:t>
+      </w:r>
+      <w:r>
+        <w:rPr>
+          <w:rStyle w:val="NormalTok"/>
+        </w:rPr>
+        <w:t xml:space="preserve"> </w:t>
+      </w:r>
+      <w:r>
+        <w:rPr>
+          <w:rStyle w:val="AttributeTok"/>
+        </w:rPr>
+        <w:t xml:space="preserve">--no-ignore</w:t>
+      </w:r>
+      <w:r>
+        <w:rPr>
+          <w:rStyle w:val="NormalTok"/>
+        </w:rPr>
+        <w:t xml:space="preserve"> </w:t>
+      </w:r>
+      <w:r>
+        <w:rPr>
+          <w:rStyle w:val="AttributeTok"/>
+        </w:rPr>
+        <w:t xml:space="preserve">--hidden</w:t>
+      </w:r>
+      <w:r>
+        <w:rPr>
+          <w:rStyle w:val="NormalTok"/>
+        </w:rPr>
+        <w:t xml:space="preserve"> </w:t>
+      </w:r>
+      <w:r>
+        <w:rPr>
+          <w:rStyle w:val="StringTok"/>
+        </w:rPr>
+        <w:t xml:space="preserve">"check_comment_reviews\("</w:t>
+      </w:r>
+      <w:r>
+        <w:rPr>
+          <w:rStyle w:val="NormalTok"/>
+        </w:rPr>
+        <w:t xml:space="preserve"> . </w:t>
+      </w:r>
+      <w:r>
+        <w:rPr>
+          <w:rStyle w:val="AttributeTok"/>
+        </w:rPr>
+        <w:t xml:space="preserve">-g</w:t>
+      </w:r>
+      <w:r>
+        <w:rPr>
+          <w:rStyle w:val="NormalTok"/>
+        </w:rPr>
+        <w:t xml:space="preserve"> </w:t>
+      </w:r>
+      <w:r>
+        <w:rPr>
+          <w:rStyle w:val="StringTok"/>
+        </w:rPr>
+        <w:t xml:space="preserve">'*.py'</w:t>
+      </w:r>
+      <w:r>
+        <w:rPr>
+          <w:rStyle w:val="NormalTok"/>
+        </w:rPr>
+        <w:t xml:space="preserve"> </w:t>
+      </w:r>
+      <w:r>
+        <w:rPr>
+          <w:rStyle w:val="CommentTok"/>
+        </w:rPr>
+        <w:t xml:space="preserve"># real matches under .claude/</w:t>
+      </w:r>
+    </w:p>
+    <w:p>
+      <w:pPr>
+        <w:pStyle w:val="Compact"/>
+        <w:numPr>
+          <w:ilvl w:val="0"/>
+          <w:numId w:val="1000"/>
+        </w:numPr>
+      </w:pPr>
+      <w:r>
+        <w:t xml:space="preserve">Add</w:t>
+      </w:r>
+      <w:r>
+        <w:t xml:space="preserve"> </w:t>
+      </w:r>
+      <w:r>
+        <w:rPr>
+          <w:rStyle w:val="VerbatimChar"/>
+          <w:b/>
+          <w:bCs/>
+        </w:rPr>
+        <w:t xml:space="preserve">--hidden</w:t>
+      </w:r>
+      <w:r>
+        <w:t xml:space="preserve"> </w:t>
+      </w:r>
+      <w:r>
+        <w:t xml:space="preserve">whenever the search may cover</w:t>
+      </w:r>
+      <w:r>
+        <w:t xml:space="preserve"> </w:t>
+      </w:r>
+      <w:r>
+        <w:rPr>
+          <w:rStyle w:val="VerbatimChar"/>
+        </w:rPr>
+        <w:t xml:space="preserve">.claude/</w:t>
+      </w:r>
+      <w:r>
+        <w:t xml:space="preserve"> </w:t>
+      </w:r>
+      <w:r>
+        <w:t xml:space="preserve">or any other</w:t>
+      </w:r>
+      <w:r>
+        <w:t xml:space="preserve"> </w:t>
+      </w:r>
+      <w:r>
+        <w:t xml:space="preserve">dotted path, or use</w:t>
+      </w:r>
+      <w:r>
+        <w:t xml:space="preserve"> </w:t>
+      </w:r>
+      <w:r>
+        <w:rPr>
+          <w:rStyle w:val="VerbatimChar"/>
+          <w:b/>
+          <w:bCs/>
+        </w:rPr>
+        <w:t xml:space="preserve">-uu</w:t>
+      </w:r>
+      <w:r>
+        <w:t xml:space="preserve">, which implies</w:t>
+      </w:r>
+      <w:r>
+        <w:t xml:space="preserve"> </w:t>
+      </w:r>
+      <w:r>
+        <w:rPr>
+          <w:i/>
+          <w:iCs/>
+        </w:rPr>
+        <w:t xml:space="preserve">both</w:t>
+      </w:r>
+      <w:r>
+        <w:t xml:space="preserve"> </w:t>
+      </w:r>
+      <w:r>
+        <w:rPr>
+          <w:rStyle w:val="VerbatimChar"/>
+        </w:rPr>
+        <w:t xml:space="preserve">--hidden</w:t>
+      </w:r>
+      <w:r>
+        <w:t xml:space="preserve"> </w:t>
+      </w:r>
+      <w:r>
+        <w:t xml:space="preserve">and</w:t>
+      </w:r>
+      <w:r>
+        <w:t xml:space="preserve"> </w:t>
+      </w:r>
+      <w:r>
+        <w:rPr>
+          <w:rStyle w:val="VerbatimChar"/>
+        </w:rPr>
+        <w:t xml:space="preserve">--no-ignore</w:t>
+      </w:r>
+      <w:r>
+        <w:t xml:space="preserve"> </w:t>
+      </w:r>
+      <w:r>
+        <w:t xml:space="preserve">in one flag — the safest default when you're not sure which</w:t>
+      </w:r>
+      <w:r>
+        <w:t xml:space="preserve"> </w:t>
+      </w:r>
+      <w:r>
+        <w:t xml:space="preserve">gotcha applies. Same failure class as the</w:t>
+      </w:r>
+      <w:r>
+        <w:t xml:space="preserve"> </w:t>
+      </w:r>
+      <w:r>
+        <w:rPr>
+          <w:rStyle w:val="VerbatimChar"/>
+        </w:rPr>
+        <w:t xml:space="preserve">.gitignore</w:t>
+      </w:r>
+      <w:r>
+        <w:t xml:space="preserve"> </w:t>
+      </w:r>
+      <w:r>
+        <w:t xml:space="preserve">foot-gun above</w:t>
+      </w:r>
+      <w:r>
+        <w:t xml:space="preserve"> </w:t>
+      </w:r>
+      <w:r>
+        <w:t xml:space="preserve">(</w:t>
+      </w:r>
+      <w:r>
+        <w:rPr>
+          <w:rStyle w:val="VerbatimChar"/>
+        </w:rPr>
+        <w:t xml:space="preserve">feedback_silent_zero_is_not_a_measurement</w:t>
+      </w:r>
+      <w:r>
+        <w:t xml:space="preserve">): a false zero over</w:t>
+      </w:r>
+      <w:r>
+        <w:t xml:space="preserve"> </w:t>
+      </w:r>
+      <w:r>
+        <w:rPr>
+          <w:rStyle w:val="VerbatimChar"/>
+        </w:rPr>
+        <w:t xml:space="preserve">.claude/</w:t>
+      </w:r>
+      <w:r>
+        <w:t xml:space="preserve"> </w:t>
+      </w:r>
+      <w:r>
+        <w:t xml:space="preserve">lands precisely on the safety-critical gate/hook tree, so an "all clear"</w:t>
+      </w:r>
+      <w:r>
+        <w:t xml:space="preserve"> </w:t>
+      </w:r>
+      <w:r>
+        <w:t xml:space="preserve">audit result over hidden paths should be treated with suspicion unless</w:t>
+      </w:r>
+      <w:r>
+        <w:t xml:space="preserve"> </w:t>
+      </w:r>
+      <w:r>
+        <w:rPr>
+          <w:rStyle w:val="VerbatimChar"/>
+        </w:rPr>
+        <w:t xml:space="preserve">--hidden</w:t>
+      </w:r>
+      <w:r>
+        <w:t xml:space="preserve">/</w:t>
+      </w:r>
+      <w:r>
+        <w:rPr>
+          <w:rStyle w:val="VerbatimChar"/>
+        </w:rPr>
+        <w:t xml:space="preserve">-uu</w:t>
+      </w:r>
+      <w:r>
+        <w:t xml:space="preserve"> </w:t>
+      </w:r>
+      <w:r>
+        <w:t xml:space="preserve">was used.</w:t>
       </w:r>
     </w:p>
     <w:p>

</xml_diff>

<commit_message>
feat(tooling): REST fallback layer + PreToolUse gate for GraphQL quota exhaustion (#1224)
Promotes feedback_gh_cli_gotchas §12 from memory to enforcement: gh_quota.py
(sensor, never itself consumes quota, degrades to unknown/allow on failure),
gh_rest.py (REST equivalents for the GraphQL-backed issue/PR/comment/project
surfaces, with tests pinning the PR-overcount and pagination-truncation
traps), and gh_quota_gate.py (PreToolUse hook: blocks a matched GraphQL-shaped
gh call with a concrete rewrite when quota is low, advises rather than blocks
when no rewrite is derivable). Live verification found gh project item-add
now has a working REST equivalent for org-owned boards, correcting the
original "GraphQL-only" assumption. Docs: docs/TOOLCHAIN.md and
ontology/conventions.md (hook table + new sections); memory folded back into
feedback_gh_cli_gotchas.md §12 rather than a competing note.

Co-Authored-By: Claude Sonnet 5 <noreply@anthropic.com>
</commit_message>
<xml_diff>
--- a/docs/office/TOOLCHAIN.docx
+++ b/docs/office/TOOLCHAIN.docx
@@ -2,7 +2,7 @@
 <file path=word/document.xml><?xml version="1.0" encoding="utf-8"?>
 <w:document xmlns:w="http://schemas.openxmlformats.org/wordprocessingml/2006/main" xmlns:m="http://schemas.openxmlformats.org/officeDocument/2006/math" xmlns:r="http://schemas.openxmlformats.org/officeDocument/2006/relationships" xmlns:o="urn:schemas-microsoft-com:office:office" xmlns:v="urn:schemas-microsoft-com:vml" xmlns:w10="urn:schemas-microsoft-com:office:word" xmlns:a="http://schemas.openxmlformats.org/drawingml/2006/main" xmlns:pic="http://schemas.openxmlformats.org/drawingml/2006/picture" xmlns:wp="http://schemas.openxmlformats.org/drawingml/2006/wordprocessingDrawing">
   <w:body>
-    <w:bookmarkStart w:id="29" w:name="noorina-labs--contributor-toolchain"/>
+    <w:bookmarkStart w:id="30" w:name="noorina-labs--contributor-toolchain"/>
     <w:p>
       <w:pPr>
         <w:pStyle w:val="Heading1"/>
@@ -4671,13 +4671,25 @@
       </w:r>
     </w:p>
     <w:bookmarkEnd w:id="18"/>
-    <w:bookmarkStart w:id="22" w:name="structural--ast-tooling"/>
+    <w:bookmarkStart w:id="19" w:name="X73702b99562c445d5bc1da798d51b5fdc308d47"/>
     <w:p>
       <w:pPr>
         <w:pStyle w:val="Heading2"/>
       </w:pPr>
       <w:r>
-        <w:t xml:space="preserve">Structural &amp; AST tooling</w:t>
+        <w:t xml:space="preserve">GitHub API quota:</w:t>
+      </w:r>
+      <w:r>
+        <w:t xml:space="preserve"> </w:t>
+      </w:r>
+      <w:r>
+        <w:rPr>
+          <w:rStyle w:val="VerbatimChar"/>
+        </w:rPr>
+        <w:t xml:space="preserve">gh</w:t>
+      </w:r>
+      <w:r>
+        <w:t xml:space="preserve">'s two independent limits</w:t>
       </w:r>
     </w:p>
     <w:p>
@@ -4685,49 +4697,16 @@
         <w:pStyle w:val="FirstParagraph"/>
       </w:pPr>
       <w:r>
-        <w:t xml:space="preserve">Every code/YAML/shell-scanning gate we run today is Python regex / line-scan,</w:t>
-      </w:r>
-      <w:r>
-        <w:t xml:space="preserve"> </w:t>
-      </w:r>
-      <w:r>
-        <w:t xml:space="preserve">and that is our recurring failure class: a regex misses a syntactic variant, so</w:t>
-      </w:r>
-      <w:r>
-        <w:t xml:space="preserve"> </w:t>
-      </w:r>
-      <w:r>
-        <w:t xml:space="preserve">"local clean" diverges from reality (</w:t>
-      </w:r>
-      <w:r>
-        <w:rPr>
-          <w:rStyle w:val="VerbatimChar"/>
-        </w:rPr>
-        <w:t xml:space="preserve">feedback_lint_gate_cover_all_syntactic_forms</w:t>
-      </w:r>
-      <w:r>
-        <w:t xml:space="preserve">,</w:t>
-      </w:r>
-      <w:r>
-        <w:t xml:space="preserve"> </w:t>
-      </w:r>
-      <w:r>
-        <w:t xml:space="preserve">the nine-issue</w:t>
-      </w:r>
-      <w:r>
-        <w:t xml:space="preserve"> </w:t>
-      </w:r>
-      <w:r>
-        <w:rPr>
-          <w:rStyle w:val="VerbatimChar"/>
-        </w:rPr>
-        <w:t xml:space="preserve">_shell_parse.py</w:t>
-      </w:r>
-      <w:r>
-        <w:t xml:space="preserve"> </w:t>
-      </w:r>
-      <w:r>
-        <w:t xml:space="preserve">bug trail). Structural tools match the</w:t>
+        <w:rPr>
+          <w:rStyle w:val="VerbatimChar"/>
+        </w:rPr>
+        <w:t xml:space="preserve">gh</w:t>
+      </w:r>
+      <w:r>
+        <w:t xml:space="preserve"> </w:t>
+      </w:r>
+      <w:r>
+        <w:t xml:space="preserve">splits its hourly rate limit across</w:t>
       </w:r>
       <w:r>
         <w:t xml:space="preserve"> </w:t>
@@ -4737,30 +4716,92 @@
           <w:b/>
           <w:bCs/>
         </w:rPr>
-        <w:t xml:space="preserve">syntax</w:t>
-      </w:r>
-      <w:r>
-        <w:rPr>
+        <w:t xml:space="preserve">two independent quotas</w:t>
+      </w:r>
+      <w:r>
+        <w:t xml:space="preserve"> </w:t>
+      </w:r>
+      <w:r>
+        <w:t xml:space="preserve">(</w:t>
+      </w:r>
+      <w:r>
+        <w:rPr>
+          <w:rStyle w:val="VerbatimChar"/>
+        </w:rPr>
+        <w:t xml:space="preserve">gh api rate_limit</w:t>
+      </w:r>
+      <w:r>
+        <w:t xml:space="preserve">):</w:t>
+      </w:r>
+      <w:r>
+        <w:t xml:space="preserve"> </w:t>
+      </w:r>
+      <w:r>
+        <w:rPr>
+          <w:rStyle w:val="VerbatimChar"/>
           <w:b/>
           <w:bCs/>
         </w:rPr>
-        <w:t xml:space="preserve"> </w:t>
-      </w:r>
-      <w:r>
-        <w:rPr>
+        <w:t xml:space="preserve">core</w:t>
+      </w:r>
+      <w:r>
+        <w:t xml:space="preserve"> </w:t>
+      </w:r>
+      <w:r>
+        <w:t xml:space="preserve">(REST, 5,000/hr) and</w:t>
+      </w:r>
+      <w:r>
+        <w:t xml:space="preserve"> </w:t>
+      </w:r>
+      <w:r>
+        <w:rPr>
+          <w:rStyle w:val="VerbatimChar"/>
           <w:b/>
           <w:bCs/>
         </w:rPr>
-        <w:t xml:space="preserve">tree</w:t>
-      </w:r>
-      <w:r>
-        <w:t xml:space="preserve">, not the text, so they are correct-by-construction for structure-dependent</w:t>
-      </w:r>
-      <w:r>
-        <w:t xml:space="preserve"> </w:t>
-      </w:r>
-      <w:r>
-        <w:t xml:space="preserve">work.</w:t>
+        <w:t xml:space="preserve">graphql</w:t>
+      </w:r>
+      <w:r>
+        <w:t xml:space="preserve"> </w:t>
+      </w:r>
+      <w:r>
+        <w:t xml:space="preserve">(5,000/hr). They drain independently — REST can sit near-full while GraphQL</w:t>
+      </w:r>
+      <w:r>
+        <w:t xml:space="preserve"> </w:t>
+      </w:r>
+      <w:r>
+        <w:t xml:space="preserve">is flat zero (</w:t>
+      </w:r>
+      <w:r>
+        <w:rPr>
+          <w:rStyle w:val="VerbatimChar"/>
+        </w:rPr>
+        <w:t xml:space="preserve">feedback_gh_cli_gotchas</w:t>
+      </w:r>
+      <w:r>
+        <w:t xml:space="preserve"> </w:t>
+      </w:r>
+      <w:r>
+        <w:t xml:space="preserve">§12; enforced by</w:t>
+      </w:r>
+      <w:r>
+        <w:t xml:space="preserve"> </w:t>
+      </w:r>
+      <w:r>
+        <w:rPr>
+          <w:rStyle w:val="VerbatimChar"/>
+        </w:rPr>
+        <w:t xml:space="preserve">gh_quota_gate.py</w:t>
+      </w:r>
+      <w:r>
+        <w:t xml:space="preserve">,</w:t>
+      </w:r>
+      <w:r>
+        <w:t xml:space="preserve"> </w:t>
+      </w:r>
+      <w:r>
+        <w:t xml:space="preserve">#1224).</w:t>
       </w:r>
     </w:p>
     <w:p>
@@ -4769,9 +4810,842 @@
       </w:pPr>
       <w:r>
         <w:rPr>
+          <w:rStyle w:val="VerbatimChar"/>
+        </w:rPr>
+        <w:t xml:space="preserve">gh</w:t>
+      </w:r>
+      <w:r>
+        <w:t xml:space="preserve">'s ergonomic read/write surfaces are mostly</w:t>
+      </w:r>
+      <w:r>
+        <w:t xml:space="preserve"> </w:t>
+      </w:r>
+      <w:r>
+        <w:rPr>
           <w:b/>
           <w:bCs/>
         </w:rPr>
+        <w:t xml:space="preserve">GraphQL-backed</w:t>
+      </w:r>
+      <w:r>
+        <w:t xml:space="preserve">, so a</w:t>
+      </w:r>
+      <w:r>
+        <w:t xml:space="preserve"> </w:t>
+      </w:r>
+      <w:r>
+        <w:t xml:space="preserve">GraphQL-exhausted session fails on</w:t>
+      </w:r>
+      <w:r>
+        <w:t xml:space="preserve"> </w:t>
+      </w:r>
+      <w:r>
+        <w:rPr>
+          <w:rStyle w:val="VerbatimChar"/>
+        </w:rPr>
+        <w:t xml:space="preserve">gh issue view/list/create</w:t>
+      </w:r>
+      <w:r>
+        <w:t xml:space="preserve">,</w:t>
+      </w:r>
+      <w:r>
+        <w:t xml:space="preserve"> </w:t>
+      </w:r>
+      <w:r>
+        <w:rPr>
+          <w:rStyle w:val="VerbatimChar"/>
+        </w:rPr>
+        <w:t xml:space="preserve">gh pr view/list/checks/comment</w:t>
+      </w:r>
+      <w:r>
+        <w:t xml:space="preserve">, and</w:t>
+      </w:r>
+      <w:r>
+        <w:t xml:space="preserve"> </w:t>
+      </w:r>
+      <w:r>
+        <w:rPr>
+          <w:rStyle w:val="VerbatimChar"/>
+        </w:rPr>
+        <w:t xml:space="preserve">gh project item-add/item-list</w:t>
+      </w:r>
+      <w:r>
+        <w:t xml:space="preserve"> </w:t>
+      </w:r>
+      <w:r>
+        <w:t xml:space="preserve">— while</w:t>
+      </w:r>
+      <w:r>
+        <w:t xml:space="preserve"> </w:t>
+      </w:r>
+      <w:r>
+        <w:rPr>
+          <w:rStyle w:val="VerbatimChar"/>
+        </w:rPr>
+        <w:t xml:space="preserve">gh api repos/...</w:t>
+      </w:r>
+      <w:r>
+        <w:t xml:space="preserve"> </w:t>
+      </w:r>
+      <w:r>
+        <w:t xml:space="preserve">(REST),</w:t>
+      </w:r>
+      <w:r>
+        <w:t xml:space="preserve"> </w:t>
+      </w:r>
+      <w:r>
+        <w:rPr>
+          <w:rStyle w:val="VerbatimChar"/>
+        </w:rPr>
+        <w:t xml:space="preserve">gh pr diff</w:t>
+      </w:r>
+      <w:r>
+        <w:t xml:space="preserve">, and</w:t>
+      </w:r>
+      <w:r>
+        <w:t xml:space="preserve"> </w:t>
+      </w:r>
+      <w:r>
+        <w:rPr>
+          <w:rStyle w:val="VerbatimChar"/>
+        </w:rPr>
+        <w:t xml:space="preserve">gh api rate_limit</w:t>
+      </w:r>
+      <w:r>
+        <w:t xml:space="preserve"> </w:t>
+      </w:r>
+      <w:r>
+        <w:t xml:space="preserve">itself (free —</w:t>
+      </w:r>
+      <w:r>
+        <w:t xml:space="preserve"> </w:t>
+      </w:r>
+      <w:r>
+        <w:t xml:space="preserve">it costs no quota) keep working. Two counter-intuitive shapes worth knowing:</w:t>
+      </w:r>
+    </w:p>
+    <w:p>
+      <w:pPr>
+        <w:pStyle w:val="Compact"/>
+        <w:numPr>
+          <w:ilvl w:val="0"/>
+          <w:numId w:val="1003"/>
+        </w:numPr>
+      </w:pPr>
+      <w:r>
+        <w:rPr>
+          <w:rStyle w:val="VerbatimChar"/>
+          <w:b/>
+          <w:bCs/>
+        </w:rPr>
+        <w:t xml:space="preserve">gh issue list</w:t>
+      </w:r>
+      <w:r>
+        <w:rPr>
+          <w:b/>
+          <w:bCs/>
+        </w:rPr>
+        <w:t xml:space="preserve"> </w:t>
+      </w:r>
+      <w:r>
+        <w:rPr>
+          <w:b/>
+          <w:bCs/>
+        </w:rPr>
+        <w:t xml:space="preserve">fails even without</w:t>
+      </w:r>
+      <w:r>
+        <w:rPr>
+          <w:b/>
+          <w:bCs/>
+        </w:rPr>
+        <w:t xml:space="preserve"> </w:t>
+      </w:r>
+      <w:r>
+        <w:rPr>
+          <w:rStyle w:val="VerbatimChar"/>
+          <w:b/>
+          <w:bCs/>
+        </w:rPr>
+        <w:t xml:space="preserve">--json</w:t>
+      </w:r>
+      <w:r>
+        <w:rPr>
+          <w:b/>
+          <w:bCs/>
+        </w:rPr>
+        <w:t xml:space="preserve">.</w:t>
+      </w:r>
+      <w:r>
+        <w:t xml:space="preserve"> </w:t>
+      </w:r>
+      <w:r>
+        <w:t xml:space="preserve">The GraphQL dependency is</w:t>
+      </w:r>
+      <w:r>
+        <w:t xml:space="preserve"> </w:t>
+      </w:r>
+      <w:r>
+        <w:t xml:space="preserve">not about output formatting; dropping</w:t>
+      </w:r>
+      <w:r>
+        <w:t xml:space="preserve"> </w:t>
+      </w:r>
+      <w:r>
+        <w:rPr>
+          <w:rStyle w:val="VerbatimChar"/>
+        </w:rPr>
+        <w:t xml:space="preserve">--json</w:t>
+      </w:r>
+      <w:r>
+        <w:t xml:space="preserve"> </w:t>
+      </w:r>
+      <w:r>
+        <w:t xml:space="preserve">is not a workaround.</w:t>
+      </w:r>
+    </w:p>
+    <w:p>
+      <w:pPr>
+        <w:pStyle w:val="Compact"/>
+        <w:numPr>
+          <w:ilvl w:val="0"/>
+          <w:numId w:val="1003"/>
+        </w:numPr>
+      </w:pPr>
+      <w:r>
+        <w:rPr>
+          <w:rStyle w:val="VerbatimChar"/>
+          <w:b/>
+          <w:bCs/>
+        </w:rPr>
+        <w:t xml:space="preserve">gh pr view --json</w:t>
+      </w:r>
+      <w:r>
+        <w:rPr>
+          <w:b/>
+          <w:bCs/>
+        </w:rPr>
+        <w:t xml:space="preserve"> </w:t>
+      </w:r>
+      <w:r>
+        <w:rPr>
+          <w:b/>
+          <w:bCs/>
+        </w:rPr>
+        <w:t xml:space="preserve">is flaky, not cleanly REST or GraphQL</w:t>
+      </w:r>
+      <w:r>
+        <w:t xml:space="preserve"> </w:t>
+      </w:r>
+      <w:r>
+        <w:t xml:space="preserve">— it can</w:t>
+      </w:r>
+      <w:r>
+        <w:t xml:space="preserve"> </w:t>
+      </w:r>
+      <w:r>
+        <w:t xml:space="preserve">succeed once and fail on an immediate repeat with an identical field set.</w:t>
+      </w:r>
+      <w:r>
+        <w:t xml:space="preserve"> </w:t>
+      </w:r>
+      <w:r>
+        <w:t xml:space="preserve">Never build logic that depends on a single success.</w:t>
+      </w:r>
+    </w:p>
+    <w:p>
+      <w:pPr>
+        <w:pStyle w:val="FirstParagraph"/>
+      </w:pPr>
+      <w:r>
+        <w:rPr>
+          <w:b/>
+          <w:bCs/>
+        </w:rPr>
+        <w:t xml:space="preserve">The failure is a silent zero, not a raised error.</w:t>
+      </w:r>
+      <w:r>
+        <w:t xml:space="preserve"> </w:t>
+      </w:r>
+      <w:r>
+        <w:t xml:space="preserve">The response body is</w:t>
+      </w:r>
+      <w:r>
+        <w:t xml:space="preserve"> </w:t>
+      </w:r>
+      <w:r>
+        <w:t xml:space="preserve">the bare string</w:t>
+      </w:r>
+      <w:r>
+        <w:t xml:space="preserve"> </w:t>
+      </w:r>
+      <w:r>
+        <w:rPr>
+          <w:rStyle w:val="VerbatimChar"/>
+        </w:rPr>
+        <w:t xml:space="preserve">GraphQL: API rate limit already exceeded for user ID &lt;n&gt;</w:t>
+      </w:r>
+      <w:r>
+        <w:t xml:space="preserve">;</w:t>
+      </w:r>
+      <w:r>
+        <w:t xml:space="preserve"> </w:t>
+      </w:r>
+      <w:r>
+        <w:t xml:space="preserve">piped through</w:t>
+      </w:r>
+      <w:r>
+        <w:t xml:space="preserve"> </w:t>
+      </w:r>
+      <w:r>
+        <w:rPr>
+          <w:rStyle w:val="VerbatimChar"/>
+        </w:rPr>
+        <w:t xml:space="preserve">jq</w:t>
+      </w:r>
+      <w:r>
+        <w:t xml:space="preserve"> </w:t>
+      </w:r>
+      <w:r>
+        <w:t xml:space="preserve">it's a parse error, and the customary</w:t>
+      </w:r>
+      <w:r>
+        <w:t xml:space="preserve"> </w:t>
+      </w:r>
+      <w:r>
+        <w:rPr>
+          <w:rStyle w:val="VerbatimChar"/>
+        </w:rPr>
+        <w:t xml:space="preserve">2&gt;/dev/null</w:t>
+      </w:r>
+      <w:r>
+        <w:t xml:space="preserve"> </w:t>
+      </w:r>
+      <w:r>
+        <w:t xml:space="preserve">turns</w:t>
+      </w:r>
+      <w:r>
+        <w:t xml:space="preserve"> </w:t>
+      </w:r>
+      <w:r>
+        <w:t xml:space="preserve">the whole thing into an indistinguishable-from-empty result — a quota outage</w:t>
+      </w:r>
+      <w:r>
+        <w:t xml:space="preserve"> </w:t>
+      </w:r>
+      <w:r>
+        <w:t xml:space="preserve">can misread as "zero issues found" or "board membership: none." Never</w:t>
+      </w:r>
+      <w:r>
+        <w:t xml:space="preserve"> </w:t>
+      </w:r>
+      <w:r>
+        <w:rPr>
+          <w:rStyle w:val="VerbatimChar"/>
+        </w:rPr>
+        <w:t xml:space="preserve">2&gt;/dev/null</w:t>
+      </w:r>
+      <w:r>
+        <w:t xml:space="preserve"> </w:t>
+      </w:r>
+      <w:r>
+        <w:t xml:space="preserve">a</w:t>
+      </w:r>
+      <w:r>
+        <w:t xml:space="preserve"> </w:t>
+      </w:r>
+      <w:r>
+        <w:rPr>
+          <w:rStyle w:val="VerbatimChar"/>
+        </w:rPr>
+        <w:t xml:space="preserve">gh</w:t>
+      </w:r>
+      <w:r>
+        <w:t xml:space="preserve"> </w:t>
+      </w:r>
+      <w:r>
+        <w:t xml:space="preserve">call whose result you're about to treat as a finding.</w:t>
+      </w:r>
+    </w:p>
+    <w:p>
+      <w:pPr>
+        <w:pStyle w:val="BodyText"/>
+      </w:pPr>
+      <w:r>
+        <w:rPr>
+          <w:b/>
+          <w:bCs/>
+        </w:rPr>
+        <w:t xml:space="preserve">When GraphQL is low, use the REST fallback layer</w:t>
+      </w:r>
+      <w:r>
+        <w:t xml:space="preserve"> </w:t>
+      </w:r>
+      <w:r>
+        <w:t xml:space="preserve">instead of retrying into</w:t>
+      </w:r>
+      <w:r>
+        <w:t xml:space="preserve"> </w:t>
+      </w:r>
+      <w:r>
+        <w:t xml:space="preserve">the same wall:</w:t>
+      </w:r>
+    </w:p>
+    <w:p>
+      <w:pPr>
+        <w:pStyle w:val="Compact"/>
+        <w:numPr>
+          <w:ilvl w:val="0"/>
+          <w:numId w:val="1004"/>
+        </w:numPr>
+      </w:pPr>
+      <w:r>
+        <w:rPr>
+          <w:rStyle w:val="VerbatimChar"/>
+        </w:rPr>
+        <w:t xml:space="preserve">python3 .claude/lib/gh_quota.py check</w:t>
+      </w:r>
+      <w:r>
+        <w:t xml:space="preserve"> </w:t>
+      </w:r>
+      <w:r>
+        <w:t xml:space="preserve">— report both quotas' remaining/</w:t>
+      </w:r>
+      <w:r>
+        <w:t xml:space="preserve"> </w:t>
+      </w:r>
+      <w:r>
+        <w:t xml:space="preserve">reset without consuming any (the sensor).</w:t>
+      </w:r>
+    </w:p>
+    <w:p>
+      <w:pPr>
+        <w:pStyle w:val="Compact"/>
+        <w:numPr>
+          <w:ilvl w:val="0"/>
+          <w:numId w:val="1004"/>
+        </w:numPr>
+      </w:pPr>
+      <w:r>
+        <w:rPr>
+          <w:rStyle w:val="VerbatimChar"/>
+        </w:rPr>
+        <w:t xml:space="preserve">python3 .claude/lib/gh_rest.py &lt;issue|pr|comment|project&gt; ...</w:t>
+      </w:r>
+      <w:r>
+        <w:t xml:space="preserve"> </w:t>
+      </w:r>
+      <w:r>
+        <w:t xml:space="preserve">— REST</w:t>
+      </w:r>
+      <w:r>
+        <w:t xml:space="preserve"> </w:t>
+      </w:r>
+      <w:r>
+        <w:t xml:space="preserve">equivalents for the GraphQL-backed surfaces above, same output shape as the</w:t>
+      </w:r>
+      <w:r>
+        <w:t xml:space="preserve"> </w:t>
+      </w:r>
+      <w:r>
+        <w:rPr>
+          <w:rStyle w:val="VerbatimChar"/>
+        </w:rPr>
+        <w:t xml:space="preserve">--json</w:t>
+      </w:r>
+      <w:r>
+        <w:t xml:space="preserve"> </w:t>
+      </w:r>
+      <w:r>
+        <w:t xml:space="preserve">form (the fallback). Two traps it guards against: the</w:t>
+      </w:r>
+      <w:r>
+        <w:t xml:space="preserve"> </w:t>
+      </w:r>
+      <w:r>
+        <w:rPr>
+          <w:rStyle w:val="VerbatimChar"/>
+        </w:rPr>
+        <w:t xml:space="preserve">repos/{o}/{r}/issues</w:t>
+      </w:r>
+      <w:r>
+        <w:t xml:space="preserve"> </w:t>
+      </w:r>
+      <w:r>
+        <w:t xml:space="preserve">endpoint returns pull requests too (filter</w:t>
+      </w:r>
+      <w:r>
+        <w:t xml:space="preserve"> </w:t>
+      </w:r>
+      <w:r>
+        <w:rPr>
+          <w:rStyle w:val="VerbatimChar"/>
+        </w:rPr>
+        <w:t xml:space="preserve">select(.pull_request == null)</w:t>
+      </w:r>
+      <w:r>
+        <w:t xml:space="preserve"> </w:t>
+      </w:r>
+      <w:r>
+        <w:t xml:space="preserve">or an issue count silently overcounts), and</w:t>
+      </w:r>
+      <w:r>
+        <w:t xml:space="preserve"> </w:t>
+      </w:r>
+      <w:r>
+        <w:t xml:space="preserve">every list read paginates with</w:t>
+      </w:r>
+      <w:r>
+        <w:t xml:space="preserve"> </w:t>
+      </w:r>
+      <w:r>
+        <w:rPr>
+          <w:rStyle w:val="VerbatimChar"/>
+        </w:rPr>
+        <w:t xml:space="preserve">--paginate</w:t>
+      </w:r>
+      <w:r>
+        <w:t xml:space="preserve"> </w:t>
+      </w:r>
+      <w:r>
+        <w:t xml:space="preserve">(a &gt;100-item result must not</w:t>
+      </w:r>
+      <w:r>
+        <w:t xml:space="preserve"> </w:t>
+      </w:r>
+      <w:r>
+        <w:t xml:space="preserve">silently truncate — sibling of the</w:t>
+      </w:r>
+      <w:r>
+        <w:t xml:space="preserve"> </w:t>
+      </w:r>
+      <w:r>
+        <w:rPr>
+          <w:rStyle w:val="VerbatimChar"/>
+        </w:rPr>
+        <w:t xml:space="preserve">item-list --limit</w:t>
+      </w:r>
+      <w:r>
+        <w:t xml:space="preserve"> </w:t>
+      </w:r>
+      <w:r>
+        <w:t xml:space="preserve">trap).</w:t>
+      </w:r>
+    </w:p>
+    <w:p>
+      <w:pPr>
+        <w:pStyle w:val="Compact"/>
+        <w:numPr>
+          <w:ilvl w:val="0"/>
+          <w:numId w:val="1004"/>
+        </w:numPr>
+      </w:pPr>
+      <w:r>
+        <w:rPr>
+          <w:rStyle w:val="VerbatimChar"/>
+        </w:rPr>
+        <w:t xml:space="preserve">gh_quota_gate.py</w:t>
+      </w:r>
+      <w:r>
+        <w:t xml:space="preserve"> </w:t>
+      </w:r>
+      <w:r>
+        <w:t xml:space="preserve">(PreToolUse hook) intercepts a GraphQL-shaped</w:t>
+      </w:r>
+      <w:r>
+        <w:t xml:space="preserve"> </w:t>
+      </w:r>
+      <w:r>
+        <w:rPr>
+          <w:rStyle w:val="VerbatimChar"/>
+        </w:rPr>
+        <w:t xml:space="preserve">gh</w:t>
+      </w:r>
+      <w:r>
+        <w:t xml:space="preserve"> </w:t>
+      </w:r>
+      <w:r>
+        <w:t xml:space="preserve">invocation when quota is low and blocks with the concrete</w:t>
+      </w:r>
+      <w:r>
+        <w:t xml:space="preserve"> </w:t>
+      </w:r>
+      <w:r>
+        <w:rPr>
+          <w:rStyle w:val="VerbatimChar"/>
+        </w:rPr>
+        <w:t xml:space="preserve">gh_rest.py</w:t>
+      </w:r>
+      <w:r>
+        <w:t xml:space="preserve"> </w:t>
+      </w:r>
+      <w:r>
+        <w:t xml:space="preserve">rewrite — or, for a shape with no derivable rewrite (a raw</w:t>
+      </w:r>
+      <w:r>
+        <w:t xml:space="preserve"> </w:t>
+      </w:r>
+      <w:r>
+        <w:rPr>
+          <w:rStyle w:val="VerbatimChar"/>
+        </w:rPr>
+        <w:t xml:space="preserve">gh api graphql</w:t>
+      </w:r>
+      <w:r>
+        <w:t xml:space="preserve"> </w:t>
+      </w:r>
+      <w:r>
+        <w:t xml:space="preserve">call, or an unmapped</w:t>
+      </w:r>
+      <w:r>
+        <w:t xml:space="preserve"> </w:t>
+      </w:r>
+      <w:r>
+        <w:rPr>
+          <w:rStyle w:val="VerbatimChar"/>
+        </w:rPr>
+        <w:t xml:space="preserve">gh project</w:t>
+      </w:r>
+      <w:r>
+        <w:t xml:space="preserve"> </w:t>
+      </w:r>
+      <w:r>
+        <w:t xml:space="preserve">verb), advises rather than blocks, so a</w:t>
+      </w:r>
+      <w:r>
+        <w:t xml:space="preserve"> </w:t>
+      </w:r>
+      <w:r>
+        <w:t xml:space="preserve">bespoke mutation with no built-in fallback isn't stranded.</w:t>
+      </w:r>
+    </w:p>
+    <w:p>
+      <w:pPr>
+        <w:pStyle w:val="FirstParagraph"/>
+      </w:pPr>
+      <w:r>
+        <w:t xml:space="preserve">Posting a comment via REST is a</w:t>
+      </w:r>
+      <w:r>
+        <w:t xml:space="preserve"> </w:t>
+      </w:r>
+      <w:r>
+        <w:rPr>
+          <w:b/>
+          <w:bCs/>
+        </w:rPr>
+        <w:t xml:space="preserve">two-step</w:t>
+      </w:r>
+      <w:r>
+        <w:t xml:space="preserve"> </w:t>
+      </w:r>
+      <w:r>
+        <w:t xml:space="preserve">operation, not one: write the</w:t>
+      </w:r>
+      <w:r>
+        <w:t xml:space="preserve"> </w:t>
+      </w:r>
+      <w:r>
+        <w:rPr>
+          <w:rStyle w:val="VerbatimChar"/>
+        </w:rPr>
+        <w:t xml:space="preserve">{"body": ...}</w:t>
+      </w:r>
+      <w:r>
+        <w:t xml:space="preserve"> </w:t>
+      </w:r>
+      <w:r>
+        <w:t xml:space="preserve">payload to a file in an earlier, separate call</w:t>
+      </w:r>
+      <w:r>
+        <w:t xml:space="preserve"> </w:t>
+      </w:r>
+      <w:r>
+        <w:t xml:space="preserve">(</w:t>
+      </w:r>
+      <w:r>
+        <w:rPr>
+          <w:rStyle w:val="VerbatimChar"/>
+        </w:rPr>
+        <w:t xml:space="preserve">gh_rest.py comment write-payload</w:t>
+      </w:r>
+      <w:r>
+        <w:t xml:space="preserve">), THEN POST it</w:t>
+      </w:r>
+      <w:r>
+        <w:t xml:space="preserve"> </w:t>
+      </w:r>
+      <w:r>
+        <w:t xml:space="preserve">(</w:t>
+      </w:r>
+      <w:r>
+        <w:rPr>
+          <w:rStyle w:val="VerbatimChar"/>
+        </w:rPr>
+        <w:t xml:space="preserve">gh_rest.py comment post</w:t>
+      </w:r>
+      <w:r>
+        <w:t xml:space="preserve">). Combining them in one Bash call trips</w:t>
+      </w:r>
+      <w:r>
+        <w:t xml:space="preserve"> </w:t>
+      </w:r>
+      <w:r>
+        <w:rPr>
+          <w:rStyle w:val="VerbatimChar"/>
+        </w:rPr>
+        <w:t xml:space="preserve">validate_review_comment_format</w:t>
+      </w:r>
+      <w:r>
+        <w:t xml:space="preserve"> </w:t>
+      </w:r>
+      <w:r>
+        <w:t xml:space="preserve">— that hook reads the payload file to</w:t>
+      </w:r>
+      <w:r>
+        <w:t xml:space="preserve"> </w:t>
+      </w:r>
+      <w:r>
+        <w:t xml:space="preserve">validate the charter review format, and blocks when the file doesn't exist</w:t>
+      </w:r>
+      <w:r>
+        <w:t xml:space="preserve"> </w:t>
+      </w:r>
+      <w:r>
+        <w:t xml:space="preserve">yet at match time.</w:t>
+      </w:r>
+    </w:p>
+    <w:p>
+      <w:pPr>
+        <w:pStyle w:val="BodyText"/>
+      </w:pPr>
+      <w:r>
+        <w:t xml:space="preserve">Full detail, the measured attribution table, and the org-owned ProjectV2</w:t>
+      </w:r>
+      <w:r>
+        <w:t xml:space="preserve"> </w:t>
+      </w:r>
+      <w:r>
+        <w:t xml:space="preserve">REST-write correction:</w:t>
+      </w:r>
+      <w:r>
+        <w:t xml:space="preserve"> </w:t>
+      </w:r>
+      <w:r>
+        <w:rPr>
+          <w:rStyle w:val="VerbatimChar"/>
+        </w:rPr>
+        <w:t xml:space="preserve">.claude/memory/feedback_gh_cli_gotchas.md</w:t>
+      </w:r>
+      <w:r>
+        <w:t xml:space="preserve"> </w:t>
+      </w:r>
+      <w:r>
+        <w:t xml:space="preserve">§12.</w:t>
+      </w:r>
+    </w:p>
+    <w:bookmarkEnd w:id="19"/>
+    <w:bookmarkStart w:id="23" w:name="structural--ast-tooling"/>
+    <w:p>
+      <w:pPr>
+        <w:pStyle w:val="Heading2"/>
+      </w:pPr>
+      <w:r>
+        <w:t xml:space="preserve">Structural &amp; AST tooling</w:t>
+      </w:r>
+    </w:p>
+    <w:p>
+      <w:pPr>
+        <w:pStyle w:val="FirstParagraph"/>
+      </w:pPr>
+      <w:r>
+        <w:t xml:space="preserve">Every code/YAML/shell-scanning gate we run today is Python regex / line-scan,</w:t>
+      </w:r>
+      <w:r>
+        <w:t xml:space="preserve"> </w:t>
+      </w:r>
+      <w:r>
+        <w:t xml:space="preserve">and that is our recurring failure class: a regex misses a syntactic variant, so</w:t>
+      </w:r>
+      <w:r>
+        <w:t xml:space="preserve"> </w:t>
+      </w:r>
+      <w:r>
+        <w:t xml:space="preserve">"local clean" diverges from reality (</w:t>
+      </w:r>
+      <w:r>
+        <w:rPr>
+          <w:rStyle w:val="VerbatimChar"/>
+        </w:rPr>
+        <w:t xml:space="preserve">feedback_lint_gate_cover_all_syntactic_forms</w:t>
+      </w:r>
+      <w:r>
+        <w:t xml:space="preserve">,</w:t>
+      </w:r>
+      <w:r>
+        <w:t xml:space="preserve"> </w:t>
+      </w:r>
+      <w:r>
+        <w:t xml:space="preserve">the nine-issue</w:t>
+      </w:r>
+      <w:r>
+        <w:t xml:space="preserve"> </w:t>
+      </w:r>
+      <w:r>
+        <w:rPr>
+          <w:rStyle w:val="VerbatimChar"/>
+        </w:rPr>
+        <w:t xml:space="preserve">_shell_parse.py</w:t>
+      </w:r>
+      <w:r>
+        <w:t xml:space="preserve"> </w:t>
+      </w:r>
+      <w:r>
+        <w:t xml:space="preserve">bug trail). Structural tools match the</w:t>
+      </w:r>
+      <w:r>
+        <w:t xml:space="preserve"> </w:t>
+      </w:r>
+      <w:r>
+        <w:rPr>
+          <w:b/>
+          <w:bCs/>
+        </w:rPr>
+        <w:t xml:space="preserve">syntax</w:t>
+      </w:r>
+      <w:r>
+        <w:rPr>
+          <w:b/>
+          <w:bCs/>
+        </w:rPr>
+        <w:t xml:space="preserve"> </w:t>
+      </w:r>
+      <w:r>
+        <w:rPr>
+          <w:b/>
+          <w:bCs/>
+        </w:rPr>
+        <w:t xml:space="preserve">tree</w:t>
+      </w:r>
+      <w:r>
+        <w:t xml:space="preserve">, not the text, so they are correct-by-construction for structure-dependent</w:t>
+      </w:r>
+      <w:r>
+        <w:t xml:space="preserve"> </w:t>
+      </w:r>
+      <w:r>
+        <w:t xml:space="preserve">work.</w:t>
+      </w:r>
+    </w:p>
+    <w:p>
+      <w:pPr>
+        <w:pStyle w:val="BodyText"/>
+      </w:pPr>
+      <w:r>
+        <w:rPr>
+          <w:b/>
+          <w:bCs/>
+        </w:rPr>
         <w:t xml:space="preserve">Rule of thumb:</w:t>
       </w:r>
       <w:r>
@@ -4858,7 +5732,7 @@
         <w:t xml:space="preserve">/ line-oriented work.</w:t>
       </w:r>
     </w:p>
-    <w:bookmarkStart w:id="19" w:name="Xc63448566dd6131b41b1182a291f300dd75089b"/>
+    <w:bookmarkStart w:id="20" w:name="Xc63448566dd6131b41b1182a291f300dd75089b"/>
     <w:p>
       <w:pPr>
         <w:pStyle w:val="Heading3"/>
@@ -5668,8 +6542,8 @@
         <w:t xml:space="preserve">line breaks don't defeat the match the way they defeat a regex.</w:t>
       </w:r>
     </w:p>
-    <w:bookmarkEnd w:id="19"/>
-    <w:bookmarkStart w:id="20" w:name="X58a1693b4a3294265f8884298eb187ba5e5ba20"/>
+    <w:bookmarkEnd w:id="20"/>
+    <w:bookmarkStart w:id="21" w:name="X58a1693b4a3294265f8884298eb187ba5e5ba20"/>
     <w:p>
       <w:pPr>
         <w:pStyle w:val="Heading3"/>
@@ -6223,8 +7097,8 @@
         </w:tc>
       </w:tr>
     </w:tbl>
-    <w:bookmarkEnd w:id="20"/>
-    <w:bookmarkStart w:id="21" w:name="Xecf10dddf5aec931c01be495daa582d7751f6e2"/>
+    <w:bookmarkEnd w:id="21"/>
+    <w:bookmarkStart w:id="22" w:name="Xecf10dddf5aec931c01be495daa582d7751f6e2"/>
     <w:p>
       <w:pPr>
         <w:pStyle w:val="Heading3"/>
@@ -6360,7 +7234,7 @@
       <w:pPr>
         <w:numPr>
           <w:ilvl w:val="0"/>
-          <w:numId w:val="1003"/>
+          <w:numId w:val="1005"/>
         </w:numPr>
       </w:pPr>
       <w:r>
@@ -6441,7 +7315,7 @@
       <w:pPr>
         <w:numPr>
           <w:ilvl w:val="0"/>
-          <w:numId w:val="1003"/>
+          <w:numId w:val="1005"/>
         </w:numPr>
       </w:pPr>
       <w:r>
@@ -6823,9 +7697,9 @@
         </w:pict>
       </w:r>
     </w:p>
-    <w:bookmarkEnd w:id="21"/>
     <w:bookmarkEnd w:id="22"/>
-    <w:bookmarkStart w:id="26" w:name="document-generation-markdown--ms-office"/>
+    <w:bookmarkEnd w:id="23"/>
+    <w:bookmarkStart w:id="27" w:name="document-generation-markdown--ms-office"/>
     <w:p>
       <w:pPr>
         <w:pStyle w:val="Heading2"/>
@@ -6908,7 +7782,7 @@
       <w:r>
         <w:t xml:space="preserve">(</w:t>
       </w:r>
-      <w:hyperlink r:id="rId23">
+      <w:hyperlink r:id="rId24">
         <w:r>
           <w:rPr>
             <w:rStyle w:val="Hyperlink"/>
@@ -6928,7 +7802,7 @@
       <w:r>
         <w:t xml:space="preserve"> </w:t>
       </w:r>
-      <w:hyperlink r:id="rId24">
+      <w:hyperlink r:id="rId25">
         <w:r>
           <w:rPr>
             <w:rStyle w:val="VerbatimChar"/>
@@ -6948,7 +7822,7 @@
       <w:r>
         <w:t xml:space="preserve"> </w:t>
       </w:r>
-      <w:hyperlink r:id="rId25">
+      <w:hyperlink r:id="rId26">
         <w:r>
           <w:rPr>
             <w:rStyle w:val="VerbatimChar"/>
@@ -7448,8 +8322,8 @@
         </w:pict>
       </w:r>
     </w:p>
-    <w:bookmarkEnd w:id="26"/>
-    <w:bookmarkStart w:id="28" w:name="see-also"/>
+    <w:bookmarkEnd w:id="27"/>
+    <w:bookmarkStart w:id="29" w:name="see-also"/>
     <w:p>
       <w:pPr>
         <w:pStyle w:val="Heading2"/>
@@ -7463,7 +8337,7 @@
         <w:pStyle w:val="Compact"/>
         <w:numPr>
           <w:ilvl w:val="0"/>
-          <w:numId w:val="1004"/>
+          <w:numId w:val="1006"/>
         </w:numPr>
       </w:pPr>
       <w:hyperlink r:id="rId12">
@@ -7498,10 +8372,10 @@
         <w:pStyle w:val="Compact"/>
         <w:numPr>
           <w:ilvl w:val="0"/>
-          <w:numId w:val="1004"/>
+          <w:numId w:val="1006"/>
         </w:numPr>
       </w:pPr>
-      <w:hyperlink r:id="rId27">
+      <w:hyperlink r:id="rId28">
         <w:r>
           <w:rPr>
             <w:rStyle w:val="VerbatimChar"/>
@@ -7527,7 +8401,7 @@
         <w:pStyle w:val="Compact"/>
         <w:numPr>
           <w:ilvl w:val="0"/>
-          <w:numId w:val="1004"/>
+          <w:numId w:val="1006"/>
         </w:numPr>
       </w:pPr>
       <w:r>
@@ -7543,8 +8417,8 @@
         <w:t xml:space="preserve">— the originating memory.</w:t>
       </w:r>
     </w:p>
-    <w:bookmarkEnd w:id="28"/>
     <w:bookmarkEnd w:id="29"/>
+    <w:bookmarkEnd w:id="30"/>
     <w:sectPr>
       <w:footnotePr>
         <w:numRestart w:val="eachSect"/>
@@ -7853,6 +8727,12 @@
     <w:abstractNumId w:val="991"/>
   </w:num>
   <w:num w:numId="1003">
+    <w:abstractNumId w:val="991"/>
+  </w:num>
+  <w:num w:numId="1004">
+    <w:abstractNumId w:val="991"/>
+  </w:num>
+  <w:num w:numId="1005">
     <w:abstractNumId w:val="99411"/>
     <w:lvlOverride w:ilvl="0">
       <w:startOverride w:val="1"/>
@@ -7882,7 +8762,7 @@
       <w:startOverride w:val="1"/>
     </w:lvlOverride>
   </w:num>
-  <w:num w:numId="1004">
+  <w:num w:numId="1006">
     <w:abstractNumId w:val="991"/>
   </w:num>
 </w:numbering>

</xml_diff>

<commit_message>
fix(docs): reflow TOOLCHAIN.md GraphQL-quota paragraph to clear MD018
`#1224).` landed at the start of a wrapped line, which markdownlint's
MD018 (no-missing-space-atx) parses as an ATX heading. Reflow the
paragraph so the issue reference no longer opens a line; regenerate
the paired docs/office/TOOLCHAIN.docx to keep the office-drift gate
green.

Fixes the sole failing check on PR #1225.
</commit_message>
<xml_diff>
--- a/docs/office/TOOLCHAIN.docx
+++ b/docs/office/TOOLCHAIN.docx
@@ -4795,13 +4795,7 @@
         <w:t xml:space="preserve">gh_quota_gate.py</w:t>
       </w:r>
       <w:r>
-        <w:t xml:space="preserve">,</w:t>
-      </w:r>
-      <w:r>
-        <w:t xml:space="preserve"> </w:t>
-      </w:r>
-      <w:r>
-        <w:t xml:space="preserve">#1224).</w:t>
+        <w:t xml:space="preserve">, #1224).</w:t>
       </w:r>
     </w:p>
     <w:p>

</xml_diff>